<commit_message>
Added csv,csv script and change absolute path
</commit_message>
<xml_diff>
--- a/Diplomayin.docx
+++ b/Diplomayin.docx
@@ -4,6 +4,15 @@
   <w:body>
     <w:sdt>
       <w:sdtPr>
+        <w:rPr>
+          <w:rFonts w:asciiTheme="minorHAnsi" w:eastAsiaTheme="minorHAnsi" w:hAnsiTheme="minorHAnsi" w:cstheme="minorBidi"/>
+          <w:b w:val="0"/>
+          <w:color w:val="auto"/>
+          <w:kern w:val="2"/>
+          <w:sz w:val="24"/>
+          <w:szCs w:val="24"/>
+          <w14:ligatures w14:val="standardContextual"/>
+        </w:rPr>
         <w:id w:val="1615319858"/>
         <w:docPartObj>
           <w:docPartGallery w:val="Table of Contents"/>
@@ -12,23 +21,23 @@
       </w:sdtPr>
       <w:sdtEndPr>
         <w:rPr>
-          <w:rFonts w:asciiTheme="minorHAnsi" w:eastAsiaTheme="minorHAnsi" w:hAnsiTheme="minorHAnsi" w:cstheme="minorBidi"/>
           <w:bCs/>
           <w:noProof/>
-          <w:color w:val="auto"/>
-          <w:kern w:val="2"/>
-          <w:sz w:val="24"/>
-          <w:szCs w:val="24"/>
-          <w14:ligatures w14:val="standardContextual"/>
         </w:rPr>
       </w:sdtEndPr>
       <w:sdtContent>
         <w:p>
           <w:pPr>
             <w:pStyle w:val="TOCHeading"/>
+            <w:rPr>
+              <w:lang w:val="hy-AM"/>
+            </w:rPr>
           </w:pPr>
           <w:r>
-            <w:t>Contents</w:t>
+            <w:rPr>
+              <w:lang w:val="hy-AM"/>
+            </w:rPr>
+            <w:t>Բովանդակություն</w:t>
           </w:r>
         </w:p>
         <w:p>
@@ -48,12 +57,13 @@
           <w:r>
             <w:fldChar w:fldCharType="separate"/>
           </w:r>
-          <w:hyperlink w:anchor="_Toc223991730" w:history="1">
+          <w:hyperlink w:anchor="_Toc224075142" w:history="1">
             <w:r>
               <w:rPr>
                 <w:rStyle w:val="Hyperlink"/>
                 <w:rFonts w:ascii="Sylfaen" w:hAnsi="Sylfaen" w:cs="Sylfaen"/>
                 <w:noProof/>
+                <w:lang w:val="hy-AM"/>
               </w:rPr>
               <w:t>Ներածություն</w:t>
             </w:r>
@@ -76,7 +86,7 @@
                 <w:noProof/>
                 <w:webHidden/>
               </w:rPr>
-              <w:instrText xml:space="preserve"> PAGEREF _Toc223991730 \h </w:instrText>
+              <w:instrText xml:space="preserve"> PAGEREF _Toc224075142 \h </w:instrText>
             </w:r>
             <w:r>
               <w:rPr>
@@ -115,12 +125,13 @@
               <w:noProof/>
             </w:rPr>
           </w:pPr>
-          <w:hyperlink w:anchor="_Toc223991731" w:history="1">
+          <w:hyperlink w:anchor="_Toc224075143" w:history="1">
             <w:r>
               <w:rPr>
                 <w:rStyle w:val="Hyperlink"/>
                 <w:rFonts w:ascii="Sylfaen" w:hAnsi="Sylfaen" w:cs="Sylfaen"/>
                 <w:noProof/>
+                <w:lang w:val="hy-AM"/>
               </w:rPr>
               <w:t>ԳԼՈՒԽ</w:t>
             </w:r>
@@ -128,6 +139,7 @@
               <w:rPr>
                 <w:rStyle w:val="Hyperlink"/>
                 <w:noProof/>
+                <w:lang w:val="hy-AM"/>
               </w:rPr>
               <w:t xml:space="preserve"> 1. </w:t>
             </w:r>
@@ -136,6 +148,7 @@
                 <w:rStyle w:val="Hyperlink"/>
                 <w:rFonts w:ascii="Sylfaen" w:hAnsi="Sylfaen" w:cs="Sylfaen"/>
                 <w:noProof/>
+                <w:lang w:val="hy-AM"/>
               </w:rPr>
               <w:t>ԳՐԱՖՆԵՐԻ</w:t>
             </w:r>
@@ -143,6 +156,7 @@
               <w:rPr>
                 <w:rStyle w:val="Hyperlink"/>
                 <w:noProof/>
+                <w:lang w:val="hy-AM"/>
               </w:rPr>
               <w:t xml:space="preserve"> </w:t>
             </w:r>
@@ -151,6 +165,7 @@
                 <w:rStyle w:val="Hyperlink"/>
                 <w:rFonts w:ascii="Sylfaen" w:hAnsi="Sylfaen" w:cs="Sylfaen"/>
                 <w:noProof/>
+                <w:lang w:val="hy-AM"/>
               </w:rPr>
               <w:t>ՏԵՍՈՒԹՅՈՒՆԻՑ</w:t>
             </w:r>
@@ -158,6 +173,7 @@
               <w:rPr>
                 <w:rStyle w:val="Hyperlink"/>
                 <w:noProof/>
+                <w:lang w:val="hy-AM"/>
               </w:rPr>
               <w:t xml:space="preserve"> </w:t>
             </w:r>
@@ -166,6 +182,7 @@
                 <w:rStyle w:val="Hyperlink"/>
                 <w:rFonts w:ascii="Sylfaen" w:hAnsi="Sylfaen" w:cs="Sylfaen"/>
                 <w:noProof/>
+                <w:lang w:val="hy-AM"/>
               </w:rPr>
               <w:t>ՕԳՏԱԳՈՐԾՎՈՂ</w:t>
             </w:r>
@@ -173,6 +190,7 @@
               <w:rPr>
                 <w:rStyle w:val="Hyperlink"/>
                 <w:noProof/>
+                <w:lang w:val="hy-AM"/>
               </w:rPr>
               <w:t xml:space="preserve"> </w:t>
             </w:r>
@@ -181,6 +199,7 @@
                 <w:rStyle w:val="Hyperlink"/>
                 <w:rFonts w:ascii="Sylfaen" w:hAnsi="Sylfaen" w:cs="Sylfaen"/>
                 <w:noProof/>
+                <w:lang w:val="hy-AM"/>
               </w:rPr>
               <w:t>ՀԱՍԿԱՑՈՒԹՅՈՒՆՆԵՐ</w:t>
             </w:r>
@@ -203,7 +222,7 @@
                 <w:noProof/>
                 <w:webHidden/>
               </w:rPr>
-              <w:instrText xml:space="preserve"> PAGEREF _Toc223991731 \h </w:instrText>
+              <w:instrText xml:space="preserve"> PAGEREF _Toc224075143 \h </w:instrText>
             </w:r>
             <w:r>
               <w:rPr>
@@ -242,11 +261,12 @@
               <w:noProof/>
             </w:rPr>
           </w:pPr>
-          <w:hyperlink w:anchor="_Toc223991732" w:history="1">
+          <w:hyperlink w:anchor="_Toc224075144" w:history="1">
             <w:r>
               <w:rPr>
                 <w:rStyle w:val="Hyperlink"/>
                 <w:noProof/>
+                <w:lang w:val="hy-AM"/>
               </w:rPr>
               <w:t xml:space="preserve">1.1 </w:t>
             </w:r>
@@ -255,6 +275,7 @@
                 <w:rStyle w:val="Hyperlink"/>
                 <w:rFonts w:ascii="Sylfaen" w:hAnsi="Sylfaen" w:cs="Sylfaen"/>
                 <w:noProof/>
+                <w:lang w:val="hy-AM"/>
               </w:rPr>
               <w:t>Գրաֆի</w:t>
             </w:r>
@@ -262,6 +283,7 @@
               <w:rPr>
                 <w:rStyle w:val="Hyperlink"/>
                 <w:noProof/>
+                <w:lang w:val="hy-AM"/>
               </w:rPr>
               <w:t xml:space="preserve"> </w:t>
             </w:r>
@@ -270,6 +292,7 @@
                 <w:rStyle w:val="Hyperlink"/>
                 <w:rFonts w:ascii="Sylfaen" w:hAnsi="Sylfaen" w:cs="Sylfaen"/>
                 <w:noProof/>
+                <w:lang w:val="hy-AM"/>
               </w:rPr>
               <w:t>սահմանումը</w:t>
             </w:r>
@@ -277,6 +300,7 @@
               <w:rPr>
                 <w:rStyle w:val="Hyperlink"/>
                 <w:noProof/>
+                <w:lang w:val="hy-AM"/>
               </w:rPr>
               <w:t xml:space="preserve">, </w:t>
             </w:r>
@@ -285,6 +309,7 @@
                 <w:rStyle w:val="Hyperlink"/>
                 <w:rFonts w:ascii="Sylfaen" w:hAnsi="Sylfaen" w:cs="Sylfaen"/>
                 <w:noProof/>
+                <w:lang w:val="hy-AM"/>
               </w:rPr>
               <w:t>տեսակները</w:t>
             </w:r>
@@ -292,6 +317,7 @@
               <w:rPr>
                 <w:rStyle w:val="Hyperlink"/>
                 <w:noProof/>
+                <w:lang w:val="hy-AM"/>
               </w:rPr>
               <w:t xml:space="preserve"> </w:t>
             </w:r>
@@ -300,6 +326,7 @@
                 <w:rStyle w:val="Hyperlink"/>
                 <w:rFonts w:ascii="Sylfaen" w:hAnsi="Sylfaen" w:cs="Sylfaen"/>
                 <w:noProof/>
+                <w:lang w:val="hy-AM"/>
               </w:rPr>
               <w:t>և</w:t>
             </w:r>
@@ -307,6 +334,7 @@
               <w:rPr>
                 <w:rStyle w:val="Hyperlink"/>
                 <w:noProof/>
+                <w:lang w:val="hy-AM"/>
               </w:rPr>
               <w:t xml:space="preserve"> </w:t>
             </w:r>
@@ -315,6 +343,7 @@
                 <w:rStyle w:val="Hyperlink"/>
                 <w:rFonts w:ascii="Sylfaen" w:hAnsi="Sylfaen" w:cs="Sylfaen"/>
                 <w:noProof/>
+                <w:lang w:val="hy-AM"/>
               </w:rPr>
               <w:t>տրման</w:t>
             </w:r>
@@ -322,6 +351,7 @@
               <w:rPr>
                 <w:rStyle w:val="Hyperlink"/>
                 <w:noProof/>
+                <w:lang w:val="hy-AM"/>
               </w:rPr>
               <w:t xml:space="preserve"> </w:t>
             </w:r>
@@ -330,6 +360,7 @@
                 <w:rStyle w:val="Hyperlink"/>
                 <w:rFonts w:ascii="Sylfaen" w:hAnsi="Sylfaen" w:cs="Sylfaen"/>
                 <w:noProof/>
+                <w:lang w:val="hy-AM"/>
               </w:rPr>
               <w:t>եղանակները</w:t>
             </w:r>
@@ -352,7 +383,7 @@
                 <w:noProof/>
                 <w:webHidden/>
               </w:rPr>
-              <w:instrText xml:space="preserve"> PAGEREF _Toc223991732 \h </w:instrText>
+              <w:instrText xml:space="preserve"> PAGEREF _Toc224075144 \h </w:instrText>
             </w:r>
             <w:r>
               <w:rPr>
@@ -391,7 +422,7 @@
               <w:noProof/>
             </w:rPr>
           </w:pPr>
-          <w:hyperlink w:anchor="_Toc223991733" w:history="1">
+          <w:hyperlink w:anchor="_Toc224075145" w:history="1">
             <w:r>
               <w:rPr>
                 <w:rStyle w:val="Hyperlink"/>
@@ -516,7 +547,7 @@
                 <w:noProof/>
                 <w:webHidden/>
               </w:rPr>
-              <w:instrText xml:space="preserve"> PAGEREF _Toc223991733 \h </w:instrText>
+              <w:instrText xml:space="preserve"> PAGEREF _Toc224075145 \h </w:instrText>
             </w:r>
             <w:r>
               <w:rPr>
@@ -555,11 +586,12 @@
               <w:noProof/>
             </w:rPr>
           </w:pPr>
-          <w:hyperlink w:anchor="_Toc223991734" w:history="1">
+          <w:hyperlink w:anchor="_Toc224075146" w:history="1">
             <w:r>
               <w:rPr>
                 <w:rStyle w:val="Hyperlink"/>
                 <w:noProof/>
+                <w:lang w:val="mt"/>
               </w:rPr>
               <w:t>1.3</w:t>
             </w:r>
@@ -568,6 +600,7 @@
                 <w:rStyle w:val="Hyperlink"/>
                 <w:noProof/>
                 <w:spacing w:val="52"/>
+                <w:lang w:val="mt"/>
               </w:rPr>
               <w:t xml:space="preserve"> </w:t>
             </w:r>
@@ -584,6 +617,7 @@
                 <w:rStyle w:val="Hyperlink"/>
                 <w:noProof/>
                 <w:spacing w:val="-7"/>
+                <w:lang w:val="mt"/>
               </w:rPr>
               <w:t xml:space="preserve"> </w:t>
             </w:r>
@@ -600,6 +634,7 @@
                 <w:rStyle w:val="Hyperlink"/>
                 <w:noProof/>
                 <w:spacing w:val="-8"/>
+                <w:lang w:val="mt"/>
               </w:rPr>
               <w:t xml:space="preserve"> </w:t>
             </w:r>
@@ -631,7 +666,7 @@
                 <w:noProof/>
                 <w:webHidden/>
               </w:rPr>
-              <w:instrText xml:space="preserve"> PAGEREF _Toc223991734 \h </w:instrText>
+              <w:instrText xml:space="preserve"> PAGEREF _Toc224075146 \h </w:instrText>
             </w:r>
             <w:r>
               <w:rPr>
@@ -670,11 +705,12 @@
               <w:noProof/>
             </w:rPr>
           </w:pPr>
-          <w:hyperlink w:anchor="_Toc223991735" w:history="1">
+          <w:hyperlink w:anchor="_Toc224075147" w:history="1">
             <w:r>
               <w:rPr>
                 <w:rStyle w:val="Hyperlink"/>
                 <w:noProof/>
+                <w:lang w:val="mt"/>
               </w:rPr>
               <w:t>1</w:t>
             </w:r>
@@ -683,6 +719,7 @@
                 <w:rStyle w:val="Hyperlink"/>
                 <w:rFonts w:ascii="Microsoft JhengHei" w:eastAsia="Microsoft JhengHei" w:hAnsi="Microsoft JhengHei" w:cs="Microsoft JhengHei" w:hint="eastAsia"/>
                 <w:noProof/>
+                <w:lang w:val="mt"/>
               </w:rPr>
               <w:t>․</w:t>
             </w:r>
@@ -690,6 +727,7 @@
               <w:rPr>
                 <w:rStyle w:val="Hyperlink"/>
                 <w:noProof/>
+                <w:lang w:val="mt"/>
               </w:rPr>
               <w:t xml:space="preserve">4 </w:t>
             </w:r>
@@ -705,6 +743,7 @@
               <w:rPr>
                 <w:rStyle w:val="Hyperlink"/>
                 <w:noProof/>
+                <w:lang w:val="mt"/>
               </w:rPr>
               <w:t xml:space="preserve">, </w:t>
             </w:r>
@@ -720,6 +759,7 @@
               <w:rPr>
                 <w:rStyle w:val="Hyperlink"/>
                 <w:noProof/>
+                <w:lang w:val="mt"/>
               </w:rPr>
               <w:t xml:space="preserve"> </w:t>
             </w:r>
@@ -735,6 +775,7 @@
               <w:rPr>
                 <w:rStyle w:val="Hyperlink"/>
                 <w:noProof/>
+                <w:lang w:val="mt"/>
               </w:rPr>
               <w:t xml:space="preserve"> </w:t>
             </w:r>
@@ -750,6 +791,7 @@
               <w:rPr>
                 <w:rStyle w:val="Hyperlink"/>
                 <w:noProof/>
+                <w:lang w:val="mt"/>
               </w:rPr>
               <w:t xml:space="preserve"> </w:t>
             </w:r>
@@ -780,7 +822,7 @@
                 <w:noProof/>
                 <w:webHidden/>
               </w:rPr>
-              <w:instrText xml:space="preserve"> PAGEREF _Toc223991735 \h </w:instrText>
+              <w:instrText xml:space="preserve"> PAGEREF _Toc224075147 \h </w:instrText>
             </w:r>
             <w:r>
               <w:rPr>
@@ -819,7 +861,7 @@
               <w:noProof/>
             </w:rPr>
           </w:pPr>
-          <w:hyperlink w:anchor="_Toc223991736" w:history="1">
+          <w:hyperlink w:anchor="_Toc224075148" w:history="1">
             <w:r>
               <w:rPr>
                 <w:rStyle w:val="Hyperlink"/>
@@ -832,6 +874,7 @@
               <w:rPr>
                 <w:rStyle w:val="Hyperlink"/>
                 <w:noProof/>
+                <w:lang w:val="mt"/>
               </w:rPr>
               <w:t xml:space="preserve"> 2. </w:t>
             </w:r>
@@ -855,6 +898,7 @@
               <w:rPr>
                 <w:rStyle w:val="Hyperlink"/>
                 <w:noProof/>
+                <w:lang w:val="mt"/>
               </w:rPr>
               <w:t xml:space="preserve"> </w:t>
             </w:r>
@@ -885,7 +929,7 @@
                 <w:noProof/>
                 <w:webHidden/>
               </w:rPr>
-              <w:instrText xml:space="preserve"> PAGEREF _Toc223991736 \h </w:instrText>
+              <w:instrText xml:space="preserve"> PAGEREF _Toc224075148 \h </w:instrText>
             </w:r>
             <w:r>
               <w:rPr>
@@ -924,7 +968,7 @@
               <w:noProof/>
             </w:rPr>
           </w:pPr>
-          <w:hyperlink w:anchor="_Toc223991737" w:history="1">
+          <w:hyperlink w:anchor="_Toc224075149" w:history="1">
             <w:r>
               <w:rPr>
                 <w:rStyle w:val="Hyperlink"/>
@@ -945,11 +989,20 @@
             <w:r>
               <w:rPr>
                 <w:rStyle w:val="Hyperlink"/>
-                <w:rFonts w:ascii="Microsoft JhengHei" w:eastAsia="Microsoft JhengHei" w:hAnsi="Microsoft JhengHei"/>
+                <w:rFonts w:ascii="Microsoft JhengHei" w:eastAsia="Microsoft JhengHei" w:hAnsi="Microsoft JhengHei" w:cs="Microsoft JhengHei" w:hint="eastAsia"/>
                 <w:noProof/>
                 <w:lang w:val="hy-AM"/>
               </w:rPr>
-              <w:t xml:space="preserve">․ </w:t>
+              <w:t>․</w:t>
+            </w:r>
+            <w:r>
+              <w:rPr>
+                <w:rStyle w:val="Hyperlink"/>
+                <w:rFonts w:eastAsia="Microsoft JhengHei"/>
+                <w:noProof/>
+                <w:lang w:val="hy-AM"/>
+              </w:rPr>
+              <w:t xml:space="preserve"> </w:t>
             </w:r>
             <w:r>
               <w:rPr>
@@ -997,7 +1050,7 @@
                 <w:noProof/>
                 <w:webHidden/>
               </w:rPr>
-              <w:instrText xml:space="preserve"> PAGEREF _Toc223991737 \h </w:instrText>
+              <w:instrText xml:space="preserve"> PAGEREF _Toc224075149 \h </w:instrText>
             </w:r>
             <w:r>
               <w:rPr>
@@ -1029,6 +1082,355 @@
           </w:hyperlink>
         </w:p>
         <w:p>
+          <w:pPr>
+            <w:pStyle w:val="TOC1"/>
+            <w:rPr>
+              <w:rFonts w:eastAsiaTheme="minorEastAsia"/>
+              <w:noProof/>
+            </w:rPr>
+          </w:pPr>
+          <w:hyperlink w:anchor="_Toc224075150" w:history="1">
+            <w:r>
+              <w:rPr>
+                <w:rStyle w:val="Hyperlink"/>
+                <w:noProof/>
+                <w:lang w:val="hy-AM"/>
+              </w:rPr>
+              <w:t>3</w:t>
+            </w:r>
+            <w:r>
+              <w:rPr>
+                <w:rStyle w:val="Hyperlink"/>
+                <w:rFonts w:ascii="Microsoft JhengHei" w:eastAsia="Microsoft JhengHei" w:hAnsi="Microsoft JhengHei" w:cs="Microsoft JhengHei" w:hint="eastAsia"/>
+                <w:noProof/>
+                <w:lang w:val="hy-AM"/>
+              </w:rPr>
+              <w:t>․</w:t>
+            </w:r>
+            <w:r>
+              <w:rPr>
+                <w:rStyle w:val="Hyperlink"/>
+                <w:rFonts w:eastAsia="Microsoft JhengHei" w:cs="MS Mincho"/>
+                <w:noProof/>
+                <w:lang w:val="hy-AM"/>
+              </w:rPr>
+              <w:t>1</w:t>
+            </w:r>
+            <w:r>
+              <w:rPr>
+                <w:rStyle w:val="Hyperlink"/>
+                <w:rFonts w:ascii="Microsoft JhengHei" w:eastAsia="Microsoft JhengHei" w:hAnsi="Microsoft JhengHei" w:cs="MS Mincho"/>
+                <w:noProof/>
+                <w:lang w:val="hy-AM"/>
+              </w:rPr>
+              <w:t xml:space="preserve"> </w:t>
+            </w:r>
+            <w:r>
+              <w:rPr>
+                <w:rStyle w:val="Hyperlink"/>
+                <w:rFonts w:ascii="Sylfaen" w:hAnsi="Sylfaen" w:cs="Sylfaen"/>
+                <w:noProof/>
+                <w:lang w:val="hy-AM"/>
+              </w:rPr>
+              <w:t>Հիմնական</w:t>
+            </w:r>
+            <w:r>
+              <w:rPr>
+                <w:rStyle w:val="Hyperlink"/>
+                <w:noProof/>
+                <w:lang w:val="hy-AM"/>
+              </w:rPr>
+              <w:t xml:space="preserve"> </w:t>
+            </w:r>
+            <w:r>
+              <w:rPr>
+                <w:rStyle w:val="Hyperlink"/>
+                <w:rFonts w:ascii="Sylfaen" w:hAnsi="Sylfaen" w:cs="Sylfaen"/>
+                <w:noProof/>
+                <w:lang w:val="hy-AM"/>
+              </w:rPr>
+              <w:t>ծրագիր</w:t>
+            </w:r>
+            <w:r>
+              <w:rPr>
+                <w:noProof/>
+                <w:webHidden/>
+              </w:rPr>
+              <w:tab/>
+            </w:r>
+            <w:r>
+              <w:rPr>
+                <w:noProof/>
+                <w:webHidden/>
+              </w:rPr>
+              <w:fldChar w:fldCharType="begin"/>
+            </w:r>
+            <w:r>
+              <w:rPr>
+                <w:noProof/>
+                <w:webHidden/>
+              </w:rPr>
+              <w:instrText xml:space="preserve"> PAGEREF _Toc224075150 \h </w:instrText>
+            </w:r>
+            <w:r>
+              <w:rPr>
+                <w:noProof/>
+                <w:webHidden/>
+              </w:rPr>
+            </w:r>
+            <w:r>
+              <w:rPr>
+                <w:noProof/>
+                <w:webHidden/>
+              </w:rPr>
+              <w:fldChar w:fldCharType="separate"/>
+            </w:r>
+            <w:r>
+              <w:rPr>
+                <w:noProof/>
+                <w:webHidden/>
+              </w:rPr>
+              <w:t>20</w:t>
+            </w:r>
+            <w:r>
+              <w:rPr>
+                <w:noProof/>
+                <w:webHidden/>
+              </w:rPr>
+              <w:fldChar w:fldCharType="end"/>
+            </w:r>
+          </w:hyperlink>
+        </w:p>
+        <w:p>
+          <w:pPr>
+            <w:pStyle w:val="TOC1"/>
+            <w:rPr>
+              <w:rFonts w:eastAsiaTheme="minorEastAsia"/>
+              <w:noProof/>
+            </w:rPr>
+          </w:pPr>
+          <w:hyperlink w:anchor="_Toc224075151" w:history="1">
+            <w:r>
+              <w:rPr>
+                <w:rStyle w:val="Hyperlink"/>
+                <w:noProof/>
+                <w:lang w:val="hy-AM"/>
+              </w:rPr>
+              <w:t>3.2</w:t>
+            </w:r>
+            <w:r>
+              <w:rPr>
+                <w:rFonts w:eastAsiaTheme="minorEastAsia"/>
+                <w:noProof/>
+              </w:rPr>
+              <w:tab/>
+            </w:r>
+            <w:r>
+              <w:rPr>
+                <w:rStyle w:val="Hyperlink"/>
+                <w:rFonts w:ascii="Sylfaen" w:hAnsi="Sylfaen" w:cs="Sylfaen"/>
+                <w:noProof/>
+                <w:lang w:val="hy-AM"/>
+              </w:rPr>
+              <w:t>Տվյալներ</w:t>
+            </w:r>
+            <w:r>
+              <w:rPr>
+                <w:rStyle w:val="Hyperlink"/>
+                <w:noProof/>
+                <w:lang w:val="hy-AM"/>
+              </w:rPr>
+              <w:t xml:space="preserve"> </w:t>
+            </w:r>
+            <w:r>
+              <w:rPr>
+                <w:rStyle w:val="Hyperlink"/>
+                <w:rFonts w:ascii="Sylfaen" w:hAnsi="Sylfaen" w:cs="Sylfaen"/>
+                <w:noProof/>
+                <w:lang w:val="hy-AM"/>
+              </w:rPr>
+              <w:t>գեներացնող</w:t>
+            </w:r>
+            <w:r>
+              <w:rPr>
+                <w:rStyle w:val="Hyperlink"/>
+                <w:noProof/>
+                <w:lang w:val="hy-AM"/>
+              </w:rPr>
+              <w:t xml:space="preserve"> </w:t>
+            </w:r>
+            <w:r>
+              <w:rPr>
+                <w:rStyle w:val="Hyperlink"/>
+                <w:rFonts w:ascii="Sylfaen" w:hAnsi="Sylfaen" w:cs="Sylfaen"/>
+                <w:noProof/>
+                <w:lang w:val="hy-AM"/>
+              </w:rPr>
+              <w:t>սկրիպտեր</w:t>
+            </w:r>
+            <w:r>
+              <w:rPr>
+                <w:noProof/>
+                <w:webHidden/>
+              </w:rPr>
+              <w:tab/>
+            </w:r>
+            <w:r>
+              <w:rPr>
+                <w:noProof/>
+                <w:webHidden/>
+              </w:rPr>
+              <w:fldChar w:fldCharType="begin"/>
+            </w:r>
+            <w:r>
+              <w:rPr>
+                <w:noProof/>
+                <w:webHidden/>
+              </w:rPr>
+              <w:instrText xml:space="preserve"> PAGEREF _Toc224075151 \h </w:instrText>
+            </w:r>
+            <w:r>
+              <w:rPr>
+                <w:noProof/>
+                <w:webHidden/>
+              </w:rPr>
+            </w:r>
+            <w:r>
+              <w:rPr>
+                <w:noProof/>
+                <w:webHidden/>
+              </w:rPr>
+              <w:fldChar w:fldCharType="separate"/>
+            </w:r>
+            <w:r>
+              <w:rPr>
+                <w:noProof/>
+                <w:webHidden/>
+              </w:rPr>
+              <w:t>24</w:t>
+            </w:r>
+            <w:r>
+              <w:rPr>
+                <w:noProof/>
+                <w:webHidden/>
+              </w:rPr>
+              <w:fldChar w:fldCharType="end"/>
+            </w:r>
+          </w:hyperlink>
+        </w:p>
+        <w:p>
+          <w:pPr>
+            <w:pStyle w:val="TOC1"/>
+            <w:rPr>
+              <w:rFonts w:eastAsiaTheme="minorEastAsia"/>
+              <w:noProof/>
+            </w:rPr>
+          </w:pPr>
+          <w:hyperlink w:anchor="_Toc224075152" w:history="1">
+            <w:r>
+              <w:rPr>
+                <w:rStyle w:val="Hyperlink"/>
+                <w:noProof/>
+                <w:lang w:val="hy-AM"/>
+              </w:rPr>
+              <w:t>3</w:t>
+            </w:r>
+            <w:r>
+              <w:rPr>
+                <w:rStyle w:val="Hyperlink"/>
+                <w:rFonts w:ascii="Microsoft JhengHei" w:eastAsia="Microsoft JhengHei" w:hAnsi="Microsoft JhengHei" w:cs="Microsoft JhengHei" w:hint="eastAsia"/>
+                <w:noProof/>
+                <w:lang w:val="hy-AM"/>
+              </w:rPr>
+              <w:t>․</w:t>
+            </w:r>
+            <w:r>
+              <w:rPr>
+                <w:rStyle w:val="Hyperlink"/>
+                <w:rFonts w:eastAsia="Microsoft YaHei"/>
+                <w:noProof/>
+                <w:lang w:val="hy-AM"/>
+              </w:rPr>
+              <w:t xml:space="preserve">3 </w:t>
+            </w:r>
+            <w:r>
+              <w:rPr>
+                <w:rStyle w:val="Hyperlink"/>
+                <w:rFonts w:ascii="Sylfaen" w:eastAsia="Microsoft YaHei" w:hAnsi="Sylfaen" w:cs="Sylfaen"/>
+                <w:noProof/>
+                <w:lang w:val="hy-AM"/>
+              </w:rPr>
+              <w:t>Ծրագրային</w:t>
+            </w:r>
+            <w:r>
+              <w:rPr>
+                <w:rStyle w:val="Hyperlink"/>
+                <w:rFonts w:eastAsia="Microsoft YaHei"/>
+                <w:noProof/>
+                <w:lang w:val="hy-AM"/>
+              </w:rPr>
+              <w:t xml:space="preserve"> </w:t>
+            </w:r>
+            <w:r>
+              <w:rPr>
+                <w:rStyle w:val="Hyperlink"/>
+                <w:rFonts w:ascii="Sylfaen" w:eastAsia="Microsoft YaHei" w:hAnsi="Sylfaen" w:cs="Sylfaen"/>
+                <w:noProof/>
+                <w:lang w:val="hy-AM"/>
+              </w:rPr>
+              <w:t>արտածում</w:t>
+            </w:r>
+            <w:r>
+              <w:rPr>
+                <w:noProof/>
+                <w:webHidden/>
+              </w:rPr>
+              <w:tab/>
+            </w:r>
+            <w:r>
+              <w:rPr>
+                <w:noProof/>
+                <w:webHidden/>
+              </w:rPr>
+              <w:fldChar w:fldCharType="begin"/>
+            </w:r>
+            <w:r>
+              <w:rPr>
+                <w:noProof/>
+                <w:webHidden/>
+              </w:rPr>
+              <w:instrText xml:space="preserve"> PAGEREF _Toc224075152 \h </w:instrText>
+            </w:r>
+            <w:r>
+              <w:rPr>
+                <w:noProof/>
+                <w:webHidden/>
+              </w:rPr>
+            </w:r>
+            <w:r>
+              <w:rPr>
+                <w:noProof/>
+                <w:webHidden/>
+              </w:rPr>
+              <w:fldChar w:fldCharType="separate"/>
+            </w:r>
+            <w:r>
+              <w:rPr>
+                <w:noProof/>
+                <w:webHidden/>
+              </w:rPr>
+              <w:t>26</w:t>
+            </w:r>
+            <w:r>
+              <w:rPr>
+                <w:noProof/>
+                <w:webHidden/>
+              </w:rPr>
+              <w:fldChar w:fldCharType="end"/>
+            </w:r>
+          </w:hyperlink>
+        </w:p>
+        <w:p>
           <w:r>
             <w:rPr>
               <w:b/>
@@ -1225,9 +1627,15 @@
     <w:p>
       <w:pPr>
         <w:pStyle w:val="Heading1"/>
-      </w:pPr>
-      <w:bookmarkStart w:id="0" w:name="_Toc223991730"/>
-      <w:r>
+        <w:rPr>
+          <w:lang w:val="hy-AM"/>
+        </w:rPr>
+      </w:pPr>
+      <w:bookmarkStart w:id="0" w:name="_Toc224075142"/>
+      <w:r>
+        <w:rPr>
+          <w:lang w:val="hy-AM"/>
+        </w:rPr>
         <w:t>Ներածություն</w:t>
       </w:r>
       <w:bookmarkEnd w:id="0"/>
@@ -1265,7 +1673,15 @@
           <w:rFonts w:ascii="GHEA Grapalat" w:hAnsi="GHEA Grapalat"/>
           <w:lang w:val="hy-AM"/>
         </w:rPr>
-        <w:t>Սոցիալական ցանցերի կառուցվածքն ու դրանցում տեղի ունեցող գործընթացները բնութագրվում են բազում ոչ ուղիղ, ոչ գծային փոխազդեցություններով։ Օգտատերերի միջև կապերը միմյանցից անկախ չեն, իսկ տեղեկատվության տարածումը հաճախ ունի կասկադային բնույթ։ Տեղեկատվական «վիրուսները», մարքեթինգային արշավները, քարոզչական հաղորդագրությունները կամ հասարակական շարժումները կարող են կարճ ժամանակում հասնել միլիոնավոր օգտատերերի։ Այս երևույթները հասկանալու համար անհրաժեշտ է կիրառել մաթեմատիկական խիստ գործիքակազմ, որը թույլ է տալիս մոդելավորել և վերլուծել մեծածավալ ցանցեր։</w:t>
+        <w:t xml:space="preserve">Սոցիալական ցանցերի կառուցվածքն ու դրանցում տեղի ունեցող գործընթացները բնութագրվում են բազում ոչ ուղիղ, ոչ գծային փոխազդեցություններով։ Օգտատերերի միջև կապերը միմյանցից անկախ չեն, իսկ տեղեկատվության տարածումը հաճախ ունի կասկադային բնույթ։ Տեղեկատվական «վիրուսները», մարքեթինգային արշավները, քարոզչական հաղորդագրությունները կամ հասարակական շարժումները կարող են կարճ ժամանակում հասնել միլիոնավոր օգտատերերի։ Այս երևույթները հասկանալու </w:t>
+      </w:r>
+      <w:r>
+        <w:rPr>
+          <w:rFonts w:ascii="GHEA Grapalat" w:hAnsi="GHEA Grapalat"/>
+          <w:lang w:val="hy-AM"/>
+        </w:rPr>
+        <w:lastRenderedPageBreak/>
+        <w:t>համար անհրաժեշտ է կիրառել մաթեմատիկական խիստ գործիքակազմ, որը թույլ է տալիս մոդելավորել և վերլուծել մեծածավալ ցանցեր։</w:t>
       </w:r>
     </w:p>
     <w:p>
@@ -1283,15 +1699,7 @@
           <w:rFonts w:ascii="GHEA Grapalat" w:hAnsi="GHEA Grapalat"/>
           <w:lang w:val="hy-AM"/>
         </w:rPr>
-        <w:t xml:space="preserve">Գրաֆների տեսությունը հանդիսանում է այդպիսի գործիքակազմի հիմնասյուներից մեկը։ Սոցիալական ցանցը ներկայացնելով որպես գրաֆ G = (V, E), որտեղ V բազմության տարրերը օգտատերերն են, իսկ E բազմության տարրերը՝ նրանց միջև </w:t>
-      </w:r>
-      <w:r>
-        <w:rPr>
-          <w:rFonts w:ascii="GHEA Grapalat" w:hAnsi="GHEA Grapalat"/>
-          <w:lang w:val="hy-AM"/>
-        </w:rPr>
-        <w:lastRenderedPageBreak/>
-        <w:t>կապերը, դառնում է հնարավոր կիրառել կառուցվածքային և սպեկտրալ անալիզի մեթոդներ, գնահատել կենտրոնականությունը, բացահայտել համայնքները, մոդելավորել տեղեկատվության հոսքերը և կանխատեսել ապագա կապերի առաջացումը։ Այս մոտեցումը թույլ է տալիս անցնել ինտուիտիվ մտածողությունից դեպի քանակական վերլուծություն։</w:t>
+        <w:t>Գրաֆների տեսությունը հանդիսանում է այդպիսի գործիքակազմի հիմնասյուներից մեկը։ Սոցիալական ցանցը ներկայացնելով որպես գրաֆ G = (V, E), որտեղ V բազմության տարրերը օգտատերերն են, իսկ E բազմության տարրերը՝ նրանց միջև կապերը, դառնում է հնարավոր կիրառել կառուցվածքային և սպեկտրալ անալիզի մեթոդներ, գնահատել կենտրոնականությունը, բացահայտել համայնքները, մոդելավորել տեղեկատվության հոսքերը և կանխատեսել ապագա կապերի առաջացումը։ Այս մոտեցումը թույլ է տալիս անցնել ինտուիտիվ մտածողությունից դեպի քանակական վերլուծություն։</w:t>
       </w:r>
     </w:p>
     <w:p>
@@ -1360,6 +1768,7 @@
           <w:b/>
           <w:lang w:val="hy-AM"/>
         </w:rPr>
+        <w:lastRenderedPageBreak/>
         <w:t xml:space="preserve">Հետազոտության օբյեկտն է </w:t>
       </w:r>
       <w:r>
@@ -1393,15 +1802,7 @@
           <w:rFonts w:ascii="GHEA Grapalat" w:hAnsi="GHEA Grapalat"/>
           <w:lang w:val="hy-AM"/>
         </w:rPr>
-        <w:t xml:space="preserve">ցանցի կառուցվածքային հատկությունները, տեղեկատվության տարածման գործընթացները և ապագա կապերի ձևավորման </w:t>
-      </w:r>
-      <w:r>
-        <w:rPr>
-          <w:rFonts w:ascii="GHEA Grapalat" w:hAnsi="GHEA Grapalat"/>
-          <w:lang w:val="hy-AM"/>
-        </w:rPr>
-        <w:lastRenderedPageBreak/>
-        <w:t>օրինաչափությունները, որոնք ուսումնասիրվում են գրաֆների տեսության գրեթե մեթոդների կիրառման միջոցով։</w:t>
+        <w:t>ցանցի կառուցվածքային հատկությունները, տեղեկատվության տարածման գործընթացները և ապագա կապերի ձևավորման օրինաչափությունները, որոնք ուսումնասիրվում են գրաֆների տեսության գրեթե մեթոդների կիրառման միջոցով։</w:t>
       </w:r>
     </w:p>
     <w:p>
@@ -1528,7 +1929,15 @@
           <w:rFonts w:ascii="GHEA Grapalat" w:hAnsi="GHEA Grapalat"/>
           <w:lang w:val="hy-AM"/>
         </w:rPr>
-        <w:t>կապված է այն հանգամանքի հետ, որ սոցիալական ցանցի վերլուծությունն իրականացվում է ոչ թե մեկ առանձին մեթոդի, այլ չորս փոխլրացնող մեթոդների համակցման միջոցով, որն ապահովում է ցանցի կառուցվածքի և դինամիկայի համակողմանի գնահատում։ Ավելին, առաջարկվում է միասնական մոտեցում, որը միավորում է համայնքային կառուցվածքի, կենտրոնականության, տեղեկատվության տարածման և ապագա կապերի կանխատեսման խնդիրները միևնույն մաթեմատիկական շրջանակում։</w:t>
+        <w:t xml:space="preserve">կապված է այն հանգամանքի հետ, որ սոցիալական ցանցի վերլուծությունն իրականացվում է ոչ թե մեկ առանձին մեթոդի, այլ չորս փոխլրացնող մեթոդների համակցման միջոցով, որն ապահովում է ցանցի </w:t>
+      </w:r>
+      <w:r>
+        <w:rPr>
+          <w:rFonts w:ascii="GHEA Grapalat" w:hAnsi="GHEA Grapalat"/>
+          <w:lang w:val="hy-AM"/>
+        </w:rPr>
+        <w:lastRenderedPageBreak/>
+        <w:t>կառուցվածքի և դինամիկայի համակողմանի գնահատում։ Ավելին, առաջարկվում է միասնական մոտեցում, որը միավորում է համայնքային կառուցվածքի, կենտրոնականության, տեղեկատվության տարածման և ապագա կապերի կանխատեսման խնդիրները միևնույն մաթեմատիկական շրջանակում։</w:t>
       </w:r>
     </w:p>
     <w:p>
@@ -1547,7 +1956,6 @@
           <w:b/>
           <w:lang w:val="hy-AM"/>
         </w:rPr>
-        <w:lastRenderedPageBreak/>
         <w:t xml:space="preserve">Աշխատանքի կիրառական նշանակությունը </w:t>
       </w:r>
       <w:r>
@@ -1601,30 +2009,51 @@
     <w:p>
       <w:pPr>
         <w:pStyle w:val="Heading1"/>
-      </w:pPr>
-      <w:bookmarkStart w:id="1" w:name="_Toc223991731"/>
-      <w:r>
+        <w:rPr>
+          <w:lang w:val="hy-AM"/>
+        </w:rPr>
+      </w:pPr>
+      <w:bookmarkStart w:id="1" w:name="_Toc224075143"/>
+      <w:r>
+        <w:rPr>
+          <w:lang w:val="hy-AM"/>
+        </w:rPr>
         <w:t>ԳԼՈՒԽ 1. ԳՐԱՖՆԵՐԻ ՏԵՍՈՒԹՅ</w:t>
       </w:r>
       <w:r>
+        <w:rPr>
+          <w:lang w:val="hy-AM"/>
+        </w:rPr>
         <w:t>ՈՒ</w:t>
       </w:r>
       <w:r>
+        <w:rPr>
+          <w:lang w:val="hy-AM"/>
+        </w:rPr>
         <w:t>Ն</w:t>
       </w:r>
       <w:r>
+        <w:rPr>
+          <w:lang w:val="hy-AM"/>
+        </w:rPr>
         <w:t>ԻՑ</w:t>
       </w:r>
       <w:r>
-        <w:t xml:space="preserve"> </w:t>
-      </w:r>
-      <w:r>
-        <w:t>ՕԳՏԱԳՈՐԾՎՈՂ</w:t>
-      </w:r>
-      <w:r>
-        <w:t xml:space="preserve"> </w:t>
-      </w:r>
-      <w:r>
+        <w:rPr>
+          <w:lang w:val="hy-AM"/>
+        </w:rPr>
+        <w:t xml:space="preserve"> </w:t>
+      </w:r>
+      <w:r>
+        <w:rPr>
+          <w:lang w:val="hy-AM"/>
+        </w:rPr>
+        <w:t xml:space="preserve">ՕԳՏԱԳՈՐԾՎՈՂ </w:t>
+      </w:r>
+      <w:r>
+        <w:rPr>
+          <w:lang w:val="hy-AM"/>
+        </w:rPr>
         <w:t>ՀԱՍԿԱՑՈՒԹՅՈՒՆՆԵՐ</w:t>
       </w:r>
       <w:bookmarkEnd w:id="1"/>
@@ -1635,13 +2064,15 @@
         <w:rPr>
           <w:sz w:val="28"/>
           <w:szCs w:val="28"/>
-        </w:rPr>
-      </w:pPr>
-      <w:bookmarkStart w:id="2" w:name="_Toc223991732"/>
+          <w:lang w:val="hy-AM"/>
+        </w:rPr>
+      </w:pPr>
+      <w:bookmarkStart w:id="2" w:name="_Toc224075144"/>
       <w:r>
         <w:rPr>
           <w:sz w:val="28"/>
           <w:szCs w:val="28"/>
+          <w:lang w:val="hy-AM"/>
         </w:rPr>
         <w:t>1.</w:t>
       </w:r>
@@ -1649,6 +2080,7 @@
         <w:rPr>
           <w:sz w:val="28"/>
           <w:szCs w:val="28"/>
+          <w:lang w:val="hy-AM"/>
         </w:rPr>
         <w:t>1</w:t>
       </w:r>
@@ -1656,83 +2088,11 @@
         <w:rPr>
           <w:sz w:val="28"/>
           <w:szCs w:val="28"/>
-        </w:rPr>
-        <w:t xml:space="preserve"> </w:t>
-      </w:r>
-      <w:proofErr w:type="spellStart"/>
-      <w:r>
-        <w:rPr>
-          <w:sz w:val="28"/>
-          <w:szCs w:val="28"/>
-        </w:rPr>
-        <w:t>Գրաֆի</w:t>
-      </w:r>
-      <w:proofErr w:type="spellEnd"/>
-      <w:r>
-        <w:rPr>
-          <w:sz w:val="28"/>
-          <w:szCs w:val="28"/>
-        </w:rPr>
-        <w:t xml:space="preserve"> </w:t>
-      </w:r>
-      <w:proofErr w:type="spellStart"/>
-      <w:r>
-        <w:rPr>
-          <w:sz w:val="28"/>
-          <w:szCs w:val="28"/>
-        </w:rPr>
-        <w:t>սահմանումը</w:t>
-      </w:r>
-      <w:proofErr w:type="spellEnd"/>
-      <w:r>
-        <w:rPr>
-          <w:sz w:val="28"/>
-          <w:szCs w:val="28"/>
-        </w:rPr>
-        <w:t xml:space="preserve">, </w:t>
-      </w:r>
-      <w:proofErr w:type="spellStart"/>
-      <w:r>
-        <w:rPr>
-          <w:sz w:val="28"/>
-          <w:szCs w:val="28"/>
-        </w:rPr>
-        <w:t>տեսակները</w:t>
-      </w:r>
-      <w:proofErr w:type="spellEnd"/>
-      <w:r>
-        <w:rPr>
-          <w:sz w:val="28"/>
-          <w:szCs w:val="28"/>
-        </w:rPr>
-        <w:t xml:space="preserve"> և </w:t>
-      </w:r>
-      <w:proofErr w:type="spellStart"/>
-      <w:r>
-        <w:rPr>
-          <w:sz w:val="28"/>
-          <w:szCs w:val="28"/>
-        </w:rPr>
-        <w:t>տրման</w:t>
-      </w:r>
-      <w:proofErr w:type="spellEnd"/>
-      <w:r>
-        <w:rPr>
-          <w:sz w:val="28"/>
-          <w:szCs w:val="28"/>
-        </w:rPr>
-        <w:t xml:space="preserve"> </w:t>
-      </w:r>
-      <w:proofErr w:type="spellStart"/>
-      <w:r>
-        <w:rPr>
-          <w:sz w:val="28"/>
-          <w:szCs w:val="28"/>
-        </w:rPr>
-        <w:t>եղանակները</w:t>
+          <w:lang w:val="hy-AM"/>
+        </w:rPr>
+        <w:t xml:space="preserve"> Գրաֆի սահմանումը, տեսակները և տրման եղանակները</w:t>
       </w:r>
       <w:bookmarkEnd w:id="2"/>
-      <w:proofErr w:type="spellEnd"/>
     </w:p>
     <w:p>
       <w:pPr>
@@ -2026,7 +2386,14 @@
         <w:rPr>
           <w:rFonts w:ascii="GHEA Grapalat" w:hAnsi="GHEA Grapalat"/>
         </w:rPr>
-        <w:t xml:space="preserve">, իսկ </w:t>
+        <w:t xml:space="preserve">, </w:t>
+      </w:r>
+      <w:r>
+        <w:rPr>
+          <w:rFonts w:ascii="GHEA Grapalat" w:hAnsi="GHEA Grapalat"/>
+        </w:rPr>
+        <w:lastRenderedPageBreak/>
+        <w:t xml:space="preserve">իսկ </w:t>
       </w:r>
       <w:r>
         <w:rPr>
@@ -2458,7 +2825,6 @@
           <w:b/>
           <w:bCs/>
         </w:rPr>
-        <w:lastRenderedPageBreak/>
         <w:t>Սահմանում</w:t>
       </w:r>
       <w:proofErr w:type="spellEnd"/>
@@ -4811,6 +5177,7 @@
       <w:r>
         <w:rPr>
           <w:rFonts w:ascii="GHEA Grapalat" w:hAnsi="GHEA Grapalat"/>
+          <w:noProof/>
           <w:sz w:val="20"/>
         </w:rPr>
         <w:drawing>
@@ -4929,6 +5296,7 @@
           <w:rFonts w:ascii="GHEA Grapalat" w:eastAsia="Cambria Math" w:hAnsi="GHEA Grapalat" w:cs="Cambria Math"/>
           <w:w w:val="105"/>
         </w:rPr>
+        <w:lastRenderedPageBreak/>
         <w:t xml:space="preserve">A(G) </w:t>
       </w:r>
       <w:r>
@@ -5436,7 +5804,6 @@
           <w:rFonts w:ascii="GHEA Grapalat" w:eastAsia="Cambria Math" w:hAnsi="GHEA Grapalat" w:cs="Cambria Math"/>
           <w:lang w:val="mt"/>
         </w:rPr>
-        <w:lastRenderedPageBreak/>
         <w:t>A(G)</w:t>
       </w:r>
       <w:r>
@@ -7014,6 +7381,7 @@
       <w:r>
         <w:rPr>
           <w:rFonts w:ascii="GHEA Grapalat" w:eastAsia="Cambria Math" w:hAnsi="GHEA Grapalat" w:cs="Cambria Math"/>
+          <w:noProof/>
           <w:lang w:val="mt"/>
         </w:rPr>
         <w:drawing>
@@ -7075,14 +7443,27 @@
       <w:r>
         <w:t xml:space="preserve"> </w:t>
       </w:r>
-      <w:fldSimple w:instr=" SEQ Նկար \* ARABIC ">
-        <w:r>
-          <w:rPr>
-            <w:noProof/>
-          </w:rPr>
-          <w:t>2</w:t>
-        </w:r>
-      </w:fldSimple>
+      <w:r>
+        <w:fldChar w:fldCharType="begin"/>
+      </w:r>
+      <w:r>
+        <w:instrText xml:space="preserve"> SEQ Նկար \* ARABIC </w:instrText>
+      </w:r>
+      <w:r>
+        <w:fldChar w:fldCharType="separate"/>
+      </w:r>
+      <w:r>
+        <w:rPr>
+          <w:noProof/>
+        </w:rPr>
+        <w:t>2</w:t>
+      </w:r>
+      <w:r>
+        <w:rPr>
+          <w:noProof/>
+        </w:rPr>
+        <w:fldChar w:fldCharType="end"/>
+      </w:r>
     </w:p>
     <w:p>
       <w:pPr>
@@ -7094,7 +7475,7 @@
           <w:szCs w:val="28"/>
         </w:rPr>
       </w:pPr>
-      <w:bookmarkStart w:id="3" w:name="_Toc223991733"/>
+      <w:bookmarkStart w:id="3" w:name="_Toc224075145"/>
       <w:r>
         <w:rPr>
           <w:rFonts w:eastAsia="Cambria Math" w:cs="Cambria Math"/>
@@ -7644,7 +8025,14 @@
         <w:rPr>
           <w:rFonts w:ascii="GHEA Grapalat" w:hAnsi="GHEA Grapalat"/>
         </w:rPr>
-        <w:t xml:space="preserve">գագաթի աստիճանը հավասար է </w:t>
+        <w:t xml:space="preserve">գագաթի աստիճանը </w:t>
+      </w:r>
+      <w:r>
+        <w:rPr>
+          <w:rFonts w:ascii="GHEA Grapalat" w:hAnsi="GHEA Grapalat"/>
+        </w:rPr>
+        <w:lastRenderedPageBreak/>
+        <w:t xml:space="preserve">հավասար է </w:t>
       </w:r>
       <w:r>
         <w:rPr>
@@ -8005,7 +8393,6 @@
         <w:rPr>
           <w:rFonts w:ascii="GHEA Grapalat" w:eastAsia="Cambria Math" w:hAnsi="GHEA Grapalat" w:cs="Cambria Math"/>
         </w:rPr>
-        <w:lastRenderedPageBreak/>
         <w:t>G</w:t>
       </w:r>
       <w:r>
@@ -10152,7 +10539,9 @@
       <w:r>
         <w:rPr>
           <w:rFonts w:ascii="GHEA Grapalat" w:hAnsi="GHEA Grapalat"/>
-        </w:rPr>
+          <w:noProof/>
+        </w:rPr>
+        <w:lastRenderedPageBreak/>
         <w:drawing>
           <wp:inline distT="0" distB="0" distL="0" distR="0" wp14:anchorId="795CB31F" wp14:editId="76C20585">
             <wp:extent cx="3740545" cy="2355771"/>
@@ -10194,6 +10583,9 @@
       <w:pPr>
         <w:pStyle w:val="Caption"/>
         <w:jc w:val="center"/>
+        <w:rPr>
+          <w:lang w:val="mt"/>
+        </w:rPr>
       </w:pPr>
       <w:proofErr w:type="spellStart"/>
       <w:r>
@@ -10204,12 +10596,18 @@
       </w:r>
       <w:proofErr w:type="spellEnd"/>
       <w:r>
+        <w:rPr>
+          <w:lang w:val="mt"/>
+        </w:rPr>
         <w:t xml:space="preserve"> </w:t>
       </w:r>
       <w:r>
         <w:fldChar w:fldCharType="begin"/>
       </w:r>
       <w:r>
+        <w:rPr>
+          <w:lang w:val="mt"/>
+        </w:rPr>
         <w:instrText xml:space="preserve"> SEQ </w:instrText>
       </w:r>
       <w:r>
@@ -10219,6 +10617,9 @@
         <w:instrText>Նկար</w:instrText>
       </w:r>
       <w:r>
+        <w:rPr>
+          <w:lang w:val="mt"/>
+        </w:rPr>
         <w:instrText xml:space="preserve"> \* ARABIC </w:instrText>
       </w:r>
       <w:r>
@@ -10227,6 +10628,7 @@
       <w:r>
         <w:rPr>
           <w:noProof/>
+          <w:lang w:val="mt"/>
         </w:rPr>
         <w:t>3</w:t>
       </w:r>
@@ -10434,7 +10836,6 @@
           <w:sz w:val="25"/>
           <w:szCs w:val="25"/>
         </w:rPr>
-        <w:lastRenderedPageBreak/>
         <w:t xml:space="preserve">ճանապարհ </w:t>
       </w:r>
       <w:r>
@@ -12756,17 +13157,7 @@
           <w:szCs w:val="25"/>
           <w:lang w:val="mt"/>
         </w:rPr>
-        <w:t>-</w:t>
-      </w:r>
-      <w:r>
-        <w:rPr>
-          <w:rFonts w:ascii="GHEA Grapalat" w:hAnsi="GHEA Grapalat"/>
-          <w:w w:val="110"/>
-          <w:sz w:val="25"/>
-          <w:szCs w:val="25"/>
-          <w:lang w:val="mt"/>
-        </w:rPr>
-        <w:t xml:space="preserve"> </w:t>
+        <w:t xml:space="preserve">- </w:t>
       </w:r>
       <w:proofErr w:type="spellStart"/>
       <w:r>
@@ -15284,6 +15675,7 @@
           <w:rFonts w:ascii="GHEA Grapalat" w:hAnsi="GHEA Grapalat"/>
           <w:w w:val="105"/>
         </w:rPr>
+        <w:lastRenderedPageBreak/>
         <w:t>ցիկլ</w:t>
       </w:r>
       <w:r>
@@ -17297,7 +17689,6 @@
           <w:w w:val="105"/>
           <w:lang w:val="mt"/>
         </w:rPr>
-        <w:lastRenderedPageBreak/>
         <w:t>G</w:t>
       </w:r>
       <w:r>
@@ -17709,13 +18100,15 @@
           <w:spacing w:val="-5"/>
           <w:sz w:val="28"/>
           <w:szCs w:val="28"/>
-        </w:rPr>
-      </w:pPr>
-      <w:bookmarkStart w:id="4" w:name="_Toc223991734"/>
+          <w:lang w:val="mt"/>
+        </w:rPr>
+      </w:pPr>
+      <w:bookmarkStart w:id="4" w:name="_Toc224075146"/>
       <w:r>
         <w:rPr>
           <w:sz w:val="28"/>
           <w:szCs w:val="28"/>
+          <w:lang w:val="mt"/>
         </w:rPr>
         <w:t>1.3</w:t>
       </w:r>
@@ -17724,6 +18117,7 @@
           <w:spacing w:val="52"/>
           <w:sz w:val="28"/>
           <w:szCs w:val="28"/>
+          <w:lang w:val="mt"/>
         </w:rPr>
         <w:t xml:space="preserve"> </w:t>
       </w:r>
@@ -17741,6 +18135,7 @@
           <w:spacing w:val="-7"/>
           <w:sz w:val="28"/>
           <w:szCs w:val="28"/>
+          <w:lang w:val="mt"/>
         </w:rPr>
         <w:t xml:space="preserve"> </w:t>
       </w:r>
@@ -17758,6 +18153,7 @@
           <w:spacing w:val="-8"/>
           <w:sz w:val="28"/>
           <w:szCs w:val="28"/>
+          <w:lang w:val="mt"/>
         </w:rPr>
         <w:t xml:space="preserve"> </w:t>
       </w:r>
@@ -18515,6 +18911,7 @@
       <w:r>
         <w:rPr>
           <w:rFonts w:ascii="GHEA Grapalat" w:hAnsi="GHEA Grapalat"/>
+          <w:noProof/>
           <w:lang w:val="mt"/>
         </w:rPr>
         <w:drawing>
@@ -18578,14 +18975,27 @@
       <w:r>
         <w:t xml:space="preserve"> </w:t>
       </w:r>
-      <w:fldSimple w:instr=" SEQ Նկար \* ARABIC ">
-        <w:r>
-          <w:rPr>
-            <w:noProof/>
-          </w:rPr>
-          <w:t>4</w:t>
-        </w:r>
-      </w:fldSimple>
+      <w:r>
+        <w:fldChar w:fldCharType="begin"/>
+      </w:r>
+      <w:r>
+        <w:instrText xml:space="preserve"> SEQ Նկար \* ARABIC </w:instrText>
+      </w:r>
+      <w:r>
+        <w:fldChar w:fldCharType="separate"/>
+      </w:r>
+      <w:r>
+        <w:rPr>
+          <w:noProof/>
+        </w:rPr>
+        <w:t>4</w:t>
+      </w:r>
+      <w:r>
+        <w:rPr>
+          <w:noProof/>
+        </w:rPr>
+        <w:fldChar w:fldCharType="end"/>
+      </w:r>
     </w:p>
     <w:p>
       <w:pPr>
@@ -18601,6 +19011,7 @@
         <w:rPr>
           <w:rFonts w:ascii="GHEA Grapalat" w:hAnsi="GHEA Grapalat"/>
         </w:rPr>
+        <w:lastRenderedPageBreak/>
         <w:t>Նկ</w:t>
       </w:r>
       <w:r>
@@ -19244,8 +19655,8 @@
       <w:r>
         <w:rPr>
           <w:rFonts w:ascii="GHEA Grapalat" w:hAnsi="GHEA Grapalat"/>
-        </w:rPr>
-        <w:lastRenderedPageBreak/>
+          <w:noProof/>
+        </w:rPr>
         <w:drawing>
           <wp:inline distT="0" distB="0" distL="0" distR="0" wp14:anchorId="524CE9AD" wp14:editId="6BAD6FE1">
             <wp:extent cx="5159187" cy="1386960"/>
@@ -19306,14 +19717,27 @@
       <w:r>
         <w:t xml:space="preserve"> </w:t>
       </w:r>
-      <w:fldSimple w:instr=" SEQ Նկար \* ARABIC ">
-        <w:r>
-          <w:rPr>
-            <w:noProof/>
-          </w:rPr>
-          <w:t>5</w:t>
-        </w:r>
-      </w:fldSimple>
+      <w:r>
+        <w:fldChar w:fldCharType="begin"/>
+      </w:r>
+      <w:r>
+        <w:instrText xml:space="preserve"> SEQ Նկար \* ARABIC </w:instrText>
+      </w:r>
+      <w:r>
+        <w:fldChar w:fldCharType="separate"/>
+      </w:r>
+      <w:r>
+        <w:rPr>
+          <w:noProof/>
+        </w:rPr>
+        <w:t>5</w:t>
+      </w:r>
+      <w:r>
+        <w:rPr>
+          <w:noProof/>
+        </w:rPr>
+        <w:fldChar w:fldCharType="end"/>
+      </w:r>
     </w:p>
     <w:p>
       <w:pPr>
@@ -20281,6 +20705,7 @@
       <w:r>
         <w:rPr>
           <w:rFonts w:ascii="GHEA Grapalat" w:hAnsi="GHEA Grapalat"/>
+          <w:noProof/>
         </w:rPr>
         <w:drawing>
           <wp:inline distT="0" distB="0" distL="0" distR="0" wp14:anchorId="548354E8" wp14:editId="145FBEFD">
@@ -20396,6 +20821,7 @@
         <w:rPr>
           <w:rFonts w:ascii="GHEA Grapalat" w:hAnsi="GHEA Grapalat"/>
         </w:rPr>
+        <w:lastRenderedPageBreak/>
         <w:t>Նկ</w:t>
       </w:r>
       <w:r>
@@ -21342,8 +21768,8 @@
           <w:rFonts w:ascii="GHEA Grapalat" w:hAnsi="GHEA Grapalat" w:cs="Sylfaen"/>
           <w:b/>
           <w:bCs/>
-        </w:rPr>
-        <w:lastRenderedPageBreak/>
+          <w:noProof/>
+        </w:rPr>
         <w:drawing>
           <wp:inline distT="0" distB="0" distL="0" distR="0" wp14:anchorId="3B18CED2" wp14:editId="6430A40C">
             <wp:extent cx="4015740" cy="2745806"/>
@@ -21567,13 +21993,15 @@
         <w:rPr>
           <w:sz w:val="28"/>
           <w:szCs w:val="28"/>
-        </w:rPr>
-      </w:pPr>
-      <w:bookmarkStart w:id="5" w:name="_Toc223991735"/>
+          <w:lang w:val="mt"/>
+        </w:rPr>
+      </w:pPr>
+      <w:bookmarkStart w:id="5" w:name="_Toc224075147"/>
       <w:r>
         <w:rPr>
           <w:sz w:val="28"/>
           <w:szCs w:val="28"/>
+          <w:lang w:val="mt"/>
         </w:rPr>
         <w:t>1</w:t>
       </w:r>
@@ -21582,6 +22010,7 @@
           <w:rFonts w:ascii="MS Mincho" w:eastAsia="MS Mincho" w:hAnsi="MS Mincho" w:cs="MS Mincho" w:hint="eastAsia"/>
           <w:sz w:val="28"/>
           <w:szCs w:val="28"/>
+          <w:lang w:val="mt"/>
         </w:rPr>
         <w:t>․</w:t>
       </w:r>
@@ -21589,6 +22018,7 @@
         <w:rPr>
           <w:sz w:val="28"/>
           <w:szCs w:val="28"/>
+          <w:lang w:val="mt"/>
         </w:rPr>
         <w:t>4</w:t>
       </w:r>
@@ -21596,6 +22026,7 @@
         <w:rPr>
           <w:sz w:val="28"/>
           <w:szCs w:val="28"/>
+          <w:lang w:val="mt"/>
         </w:rPr>
         <w:t xml:space="preserve"> </w:t>
       </w:r>
@@ -21616,6 +22047,7 @@
           <w:b/>
           <w:sz w:val="28"/>
           <w:szCs w:val="28"/>
+          <w:lang w:val="mt"/>
         </w:rPr>
         <w:t xml:space="preserve">, </w:t>
       </w:r>
@@ -21627,18 +22059,20 @@
           <w:sz w:val="28"/>
           <w:szCs w:val="28"/>
         </w:rPr>
-        <w:t>մ</w:t>
-      </w:r>
+        <w:t>միակցման</w:t>
+      </w:r>
+      <w:proofErr w:type="spellEnd"/>
       <w:r>
         <w:rPr>
           <w:rStyle w:val="Heading1Char"/>
           <w:b/>
           <w:sz w:val="28"/>
           <w:szCs w:val="28"/>
-        </w:rPr>
-        <w:t>իակցման</w:t>
-      </w:r>
-      <w:proofErr w:type="spellEnd"/>
+          <w:lang w:val="mt"/>
+        </w:rPr>
+        <w:t xml:space="preserve"> </w:t>
+      </w:r>
+      <w:proofErr w:type="spellStart"/>
       <w:r>
         <w:rPr>
           <w:rStyle w:val="Heading1Char"/>
@@ -21646,19 +22080,19 @@
           <w:sz w:val="28"/>
           <w:szCs w:val="28"/>
         </w:rPr>
-        <w:t xml:space="preserve"> </w:t>
-      </w:r>
-      <w:proofErr w:type="spellStart"/>
+        <w:t>կետեր</w:t>
+      </w:r>
+      <w:proofErr w:type="spellEnd"/>
       <w:r>
         <w:rPr>
           <w:rStyle w:val="Heading1Char"/>
           <w:b/>
           <w:sz w:val="28"/>
           <w:szCs w:val="28"/>
-        </w:rPr>
-        <w:t>կետեր</w:t>
-      </w:r>
-      <w:proofErr w:type="spellEnd"/>
+          <w:lang w:val="mt"/>
+        </w:rPr>
+        <w:t xml:space="preserve"> </w:t>
+      </w:r>
       <w:r>
         <w:rPr>
           <w:rStyle w:val="Heading1Char"/>
@@ -21666,7 +22100,17 @@
           <w:sz w:val="28"/>
           <w:szCs w:val="28"/>
         </w:rPr>
-        <w:t xml:space="preserve"> և </w:t>
+        <w:t>և</w:t>
+      </w:r>
+      <w:r>
+        <w:rPr>
+          <w:rStyle w:val="Heading1Char"/>
+          <w:b/>
+          <w:sz w:val="28"/>
+          <w:szCs w:val="28"/>
+          <w:lang w:val="mt"/>
+        </w:rPr>
+        <w:t xml:space="preserve"> </w:t>
       </w:r>
       <w:proofErr w:type="spellStart"/>
       <w:r>
@@ -22724,6 +23168,7 @@
         <w:rPr>
           <w:rFonts w:ascii="GHEA Grapalat" w:hAnsi="GHEA Grapalat"/>
         </w:rPr>
+        <w:lastRenderedPageBreak/>
         <w:t>Նկատենք,</w:t>
       </w:r>
       <w:r>
@@ -23392,14 +23837,7 @@
         <w:rPr>
           <w:rFonts w:ascii="GHEA Grapalat" w:hAnsi="GHEA Grapalat"/>
         </w:rPr>
-        <w:t xml:space="preserve">գրաֆը </w:t>
-      </w:r>
-      <w:r>
-        <w:rPr>
-          <w:rFonts w:ascii="GHEA Grapalat" w:hAnsi="GHEA Grapalat"/>
-        </w:rPr>
-        <w:lastRenderedPageBreak/>
-        <w:t>կապակցված չէ:</w:t>
+        <w:t>գրաֆը կապակցված չէ:</w:t>
       </w:r>
     </w:p>
     <w:p>
@@ -23429,6 +23867,7 @@
           <w:rFonts w:ascii="GHEA Grapalat" w:hAnsi="GHEA Grapalat"/>
           <w:b/>
           <w:bCs/>
+          <w:noProof/>
           <w:sz w:val="28"/>
           <w:szCs w:val="28"/>
           <w:lang w:val="mt"/>
@@ -23494,14 +23933,27 @@
       <w:r>
         <w:t xml:space="preserve"> </w:t>
       </w:r>
-      <w:fldSimple w:instr=" SEQ Նկար \* ARABIC ">
-        <w:r>
-          <w:rPr>
-            <w:noProof/>
-          </w:rPr>
-          <w:t>8</w:t>
-        </w:r>
-      </w:fldSimple>
+      <w:r>
+        <w:fldChar w:fldCharType="begin"/>
+      </w:r>
+      <w:r>
+        <w:instrText xml:space="preserve"> SEQ Նկար \* ARABIC </w:instrText>
+      </w:r>
+      <w:r>
+        <w:fldChar w:fldCharType="separate"/>
+      </w:r>
+      <w:r>
+        <w:rPr>
+          <w:noProof/>
+        </w:rPr>
+        <w:t>8</w:t>
+      </w:r>
+      <w:r>
+        <w:rPr>
+          <w:noProof/>
+        </w:rPr>
+        <w:fldChar w:fldCharType="end"/>
+      </w:r>
     </w:p>
     <w:p>
       <w:pPr>
@@ -23759,14 +24211,7 @@
           <w:rFonts w:ascii="GHEA Grapalat" w:hAnsi="GHEA Grapalat"/>
           <w:w w:val="105"/>
         </w:rPr>
-        <w:t xml:space="preserve"> </w:t>
-      </w:r>
-      <w:r>
-        <w:rPr>
-          <w:rFonts w:ascii="GHEA Grapalat" w:hAnsi="GHEA Grapalat"/>
-          <w:w w:val="105"/>
-        </w:rPr>
-        <w:t>գագաթները</w:t>
+        <w:t xml:space="preserve"> գագաթները</w:t>
       </w:r>
       <w:r>
         <w:rPr>
@@ -24107,13 +24552,25 @@
     <w:p>
       <w:pPr>
         <w:pStyle w:val="Heading1"/>
-      </w:pPr>
-      <w:bookmarkStart w:id="6" w:name="_Toc223991736"/>
+        <w:rPr>
+          <w:lang w:val="mt"/>
+        </w:rPr>
+      </w:pPr>
+      <w:bookmarkStart w:id="6" w:name="_Toc224075148"/>
       <w:r>
         <w:lastRenderedPageBreak/>
-        <w:t xml:space="preserve">ԳԼՈԻԽ </w:t>
-      </w:r>
-      <w:r>
+        <w:t>ԳԼՈԻԽ</w:t>
+      </w:r>
+      <w:r>
+        <w:rPr>
+          <w:lang w:val="mt"/>
+        </w:rPr>
+        <w:t xml:space="preserve"> </w:t>
+      </w:r>
+      <w:r>
+        <w:rPr>
+          <w:lang w:val="mt"/>
+        </w:rPr>
         <w:t xml:space="preserve">2. </w:t>
       </w:r>
       <w:r>
@@ -24123,7 +24580,16 @@
         <w:t xml:space="preserve">Louvain </w:t>
       </w:r>
       <w:r>
-        <w:t>ԱԼԳՈՐԻԹՄԻ ՆԿԱՐԱԳՐՈՒԹՅՈՒՆ</w:t>
+        <w:t>ԱԼԳՈՐԻԹՄԻ</w:t>
+      </w:r>
+      <w:r>
+        <w:rPr>
+          <w:lang w:val="mt"/>
+        </w:rPr>
+        <w:t xml:space="preserve"> </w:t>
+      </w:r>
+      <w:r>
+        <w:t>ՆԿԱՐԱԳՐՈՒԹՅՈՒՆ</w:t>
       </w:r>
       <w:bookmarkEnd w:id="6"/>
     </w:p>
@@ -25002,9 +25468,9 @@
           <w:lang w:val="ru-RU"/>
         </w:rPr>
         <w:drawing>
-          <wp:inline distT="0" distB="0" distL="0" distR="0" wp14:anchorId="79870811" wp14:editId="4923C38A">
-            <wp:extent cx="6336665" cy="1200785"/>
-            <wp:effectExtent l="0" t="0" r="6985" b="0"/>
+          <wp:inline distT="0" distB="0" distL="0" distR="0" wp14:anchorId="79870811" wp14:editId="44435B5F">
+            <wp:extent cx="5816773" cy="1200715"/>
+            <wp:effectExtent l="0" t="0" r="0" b="0"/>
             <wp:docPr id="777328674" name="Picture 1"/>
             <wp:cNvGraphicFramePr>
               <a:graphicFrameLocks xmlns:a="http://schemas.openxmlformats.org/drawingml/2006/main" noChangeAspect="1"/>
@@ -25025,7 +25491,7 @@
                   <pic:spPr>
                     <a:xfrm>
                       <a:off x="0" y="0"/>
-                      <a:ext cx="6336665" cy="1200785"/>
+                      <a:ext cx="5831284" cy="1203710"/>
                     </a:xfrm>
                     <a:prstGeom prst="rect">
                       <a:avLst/>
@@ -33342,7 +33808,7 @@
           <w:lang w:val="hy-AM"/>
         </w:rPr>
       </w:pPr>
-      <w:bookmarkStart w:id="7" w:name="_Toc223991737"/>
+      <w:bookmarkStart w:id="7" w:name="_Toc224075149"/>
       <w:r>
         <w:rPr>
           <w:lang w:val="hy-AM"/>
@@ -33351,22 +33817,77 @@
       </w:r>
       <w:r>
         <w:rPr>
-          <w:rFonts w:ascii="Microsoft JhengHei" w:eastAsia="Microsoft JhengHei" w:hAnsi="Microsoft JhengHei"/>
-          <w:lang w:val="hy-AM"/>
-        </w:rPr>
-        <w:t xml:space="preserve">․ </w:t>
+          <w:rFonts w:ascii="MS Mincho" w:eastAsia="MS Mincho" w:hAnsi="MS Mincho" w:cs="MS Mincho" w:hint="eastAsia"/>
+          <w:lang w:val="hy-AM"/>
+        </w:rPr>
+        <w:t>․</w:t>
       </w:r>
       <w:r>
         <w:rPr>
           <w:rFonts w:eastAsia="Microsoft JhengHei"/>
           <w:lang w:val="hy-AM"/>
         </w:rPr>
-        <w:t>ԾՐԱԳՐԱՅԻՆ ՄԱՍ</w:t>
+        <w:t xml:space="preserve"> ԾՐԱԳՐԱՅԻՆ ՄԱՍ</w:t>
       </w:r>
       <w:bookmarkEnd w:id="7"/>
     </w:p>
     <w:p>
       <w:pPr>
+        <w:pStyle w:val="Heading1"/>
+        <w:rPr>
+          <w:sz w:val="28"/>
+          <w:szCs w:val="28"/>
+          <w:lang w:val="hy-AM"/>
+        </w:rPr>
+      </w:pPr>
+      <w:bookmarkStart w:id="8" w:name="_Toc224075150"/>
+      <w:r>
+        <w:rPr>
+          <w:sz w:val="28"/>
+          <w:szCs w:val="28"/>
+          <w:lang w:val="hy-AM"/>
+        </w:rPr>
+        <w:t>3</w:t>
+      </w:r>
+      <w:r>
+        <w:rPr>
+          <w:rFonts w:ascii="MS Mincho" w:eastAsia="MS Mincho" w:hAnsi="MS Mincho" w:cs="MS Mincho" w:hint="eastAsia"/>
+          <w:sz w:val="28"/>
+          <w:szCs w:val="28"/>
+          <w:lang w:val="hy-AM"/>
+        </w:rPr>
+        <w:t>․</w:t>
+      </w:r>
+      <w:r>
+        <w:rPr>
+          <w:rFonts w:eastAsia="Microsoft JhengHei" w:cs="MS Mincho"/>
+          <w:sz w:val="28"/>
+          <w:szCs w:val="28"/>
+          <w:lang w:val="hy-AM"/>
+        </w:rPr>
+        <w:t>1</w:t>
+      </w:r>
+      <w:r>
+        <w:rPr>
+          <w:rFonts w:ascii="Microsoft JhengHei" w:eastAsia="Microsoft JhengHei" w:hAnsi="Microsoft JhengHei" w:cs="MS Mincho"/>
+          <w:sz w:val="28"/>
+          <w:szCs w:val="28"/>
+          <w:lang w:val="hy-AM"/>
+        </w:rPr>
+        <w:t xml:space="preserve"> </w:t>
+      </w:r>
+      <w:r>
+        <w:rPr>
+          <w:sz w:val="28"/>
+          <w:szCs w:val="28"/>
+          <w:lang w:val="hy-AM"/>
+        </w:rPr>
+        <w:t>Հիմնական ծրագիր</w:t>
+      </w:r>
+      <w:bookmarkEnd w:id="8"/>
+    </w:p>
+    <w:p>
+      <w:pPr>
         <w:spacing w:line="360" w:lineRule="auto"/>
         <w:rPr>
           <w:rFonts w:ascii="GHEA Grapalat" w:hAnsi="GHEA Grapalat"/>
@@ -33475,70 +33996,70 @@
           <w:rFonts w:ascii="GHEA Grapalat" w:hAnsi="GHEA Grapalat"/>
           <w:bCs/>
         </w:rPr>
-        <w:br/>
-      </w:r>
-      <w:proofErr w:type="spellStart"/>
-      <w:r>
-        <w:rPr>
-          <w:rFonts w:ascii="GHEA Grapalat" w:hAnsi="GHEA Grapalat"/>
-          <w:bCs/>
-        </w:rPr>
-        <w:t>df</w:t>
-      </w:r>
-      <w:proofErr w:type="spellEnd"/>
-      <w:r>
-        <w:rPr>
-          <w:rFonts w:ascii="GHEA Grapalat" w:hAnsi="GHEA Grapalat"/>
-          <w:bCs/>
-        </w:rPr>
-        <w:t xml:space="preserve"> = </w:t>
-      </w:r>
-      <w:proofErr w:type="spellStart"/>
-      <w:r>
-        <w:rPr>
-          <w:rFonts w:ascii="GHEA Grapalat" w:hAnsi="GHEA Grapalat"/>
-          <w:bCs/>
-        </w:rPr>
-        <w:t>pd.read_csv</w:t>
-      </w:r>
-      <w:proofErr w:type="spellEnd"/>
-      <w:r>
-        <w:rPr>
-          <w:rFonts w:ascii="GHEA Grapalat" w:hAnsi="GHEA Grapalat"/>
-          <w:bCs/>
-        </w:rPr>
-        <w:t>(</w:t>
-      </w:r>
-      <w:proofErr w:type="spellStart"/>
-      <w:r>
-        <w:rPr>
-          <w:rFonts w:ascii="GHEA Grapalat" w:hAnsi="GHEA Grapalat"/>
-          <w:bCs/>
-        </w:rPr>
-        <w:t>r"C</w:t>
-      </w:r>
-      <w:proofErr w:type="spellEnd"/>
-      <w:r>
-        <w:rPr>
-          <w:rFonts w:ascii="GHEA Grapalat" w:hAnsi="GHEA Grapalat"/>
-          <w:bCs/>
-        </w:rPr>
-        <w:t>:\Users\tiggr\Downloads\data_dip.csv")</w:t>
-      </w:r>
-      <w:r>
-        <w:rPr>
-          <w:rFonts w:ascii="GHEA Grapalat" w:hAnsi="GHEA Grapalat"/>
-          <w:bCs/>
-        </w:rPr>
-        <w:br/>
-      </w:r>
-      <w:r>
-        <w:rPr>
-          <w:rFonts w:ascii="GHEA Grapalat" w:hAnsi="GHEA Grapalat"/>
-          <w:bCs/>
-        </w:rPr>
         <w:lastRenderedPageBreak/>
         <w:br/>
+      </w:r>
+      <w:proofErr w:type="spellStart"/>
+      <w:r>
+        <w:rPr>
+          <w:rFonts w:ascii="GHEA Grapalat" w:hAnsi="GHEA Grapalat"/>
+          <w:bCs/>
+        </w:rPr>
+        <w:t>df</w:t>
+      </w:r>
+      <w:proofErr w:type="spellEnd"/>
+      <w:r>
+        <w:rPr>
+          <w:rFonts w:ascii="GHEA Grapalat" w:hAnsi="GHEA Grapalat"/>
+          <w:bCs/>
+        </w:rPr>
+        <w:t xml:space="preserve"> = </w:t>
+      </w:r>
+      <w:proofErr w:type="spellStart"/>
+      <w:r>
+        <w:rPr>
+          <w:rFonts w:ascii="GHEA Grapalat" w:hAnsi="GHEA Grapalat"/>
+          <w:bCs/>
+        </w:rPr>
+        <w:t>pd.read_csv</w:t>
+      </w:r>
+      <w:proofErr w:type="spellEnd"/>
+      <w:r>
+        <w:rPr>
+          <w:rFonts w:ascii="GHEA Grapalat" w:hAnsi="GHEA Grapalat"/>
+          <w:bCs/>
+        </w:rPr>
+        <w:t>(</w:t>
+      </w:r>
+      <w:proofErr w:type="spellStart"/>
+      <w:r>
+        <w:rPr>
+          <w:rFonts w:ascii="GHEA Grapalat" w:hAnsi="GHEA Grapalat"/>
+          <w:bCs/>
+        </w:rPr>
+        <w:t>r"C</w:t>
+      </w:r>
+      <w:proofErr w:type="spellEnd"/>
+      <w:r>
+        <w:rPr>
+          <w:rFonts w:ascii="GHEA Grapalat" w:hAnsi="GHEA Grapalat"/>
+          <w:bCs/>
+        </w:rPr>
+        <w:t>:\Users\tiggr\Downloads\data_dip.csv")</w:t>
+      </w:r>
+      <w:r>
+        <w:rPr>
+          <w:rFonts w:ascii="GHEA Grapalat" w:hAnsi="GHEA Grapalat"/>
+          <w:bCs/>
+        </w:rPr>
+        <w:br/>
+      </w:r>
+      <w:r>
+        <w:rPr>
+          <w:rFonts w:ascii="GHEA Grapalat" w:hAnsi="GHEA Grapalat"/>
+          <w:bCs/>
+        </w:rPr>
+        <w:br/>
         <w:t xml:space="preserve">G1 = </w:t>
       </w:r>
       <w:proofErr w:type="spellStart"/>
@@ -33935,6 +34456,7 @@
           <w:rFonts w:ascii="GHEA Grapalat" w:hAnsi="GHEA Grapalat"/>
           <w:bCs/>
         </w:rPr>
+        <w:lastRenderedPageBreak/>
         <w:br/>
         <w:t xml:space="preserve">    if not </w:t>
       </w:r>
@@ -33982,7 +34504,6 @@
           <w:rFonts w:ascii="GHEA Grapalat" w:hAnsi="GHEA Grapalat"/>
           <w:bCs/>
         </w:rPr>
-        <w:lastRenderedPageBreak/>
         <w:br/>
         <w:t xml:space="preserve">        friends = str(row["</w:t>
       </w:r>
@@ -34358,6 +34879,13 @@
           <w:bCs/>
         </w:rPr>
         <w:br/>
+      </w:r>
+      <w:r>
+        <w:rPr>
+          <w:rFonts w:ascii="GHEA Grapalat" w:hAnsi="GHEA Grapalat"/>
+          <w:bCs/>
+        </w:rPr>
+        <w:lastRenderedPageBreak/>
         <w:t xml:space="preserve">    communities = {}</w:t>
       </w:r>
       <w:r>
@@ -34373,13 +34901,6 @@
           <w:bCs/>
         </w:rPr>
         <w:br/>
-      </w:r>
-      <w:r>
-        <w:rPr>
-          <w:rFonts w:ascii="GHEA Grapalat" w:hAnsi="GHEA Grapalat"/>
-          <w:bCs/>
-        </w:rPr>
-        <w:lastRenderedPageBreak/>
         <w:t xml:space="preserve">    for node, com in </w:t>
       </w:r>
       <w:proofErr w:type="spellStart"/>
@@ -35063,6 +35584,13 @@
           <w:bCs/>
         </w:rPr>
         <w:br/>
+      </w:r>
+      <w:r>
+        <w:rPr>
+          <w:rFonts w:ascii="GHEA Grapalat" w:hAnsi="GHEA Grapalat"/>
+          <w:bCs/>
+        </w:rPr>
+        <w:lastRenderedPageBreak/>
         <w:t xml:space="preserve">    </w:t>
       </w:r>
       <w:proofErr w:type="spellStart"/>
@@ -35111,265 +35639,1237 @@
           <w:bCs/>
         </w:rPr>
         <w:br/>
-      </w:r>
-      <w:r>
-        <w:rPr>
-          <w:rFonts w:ascii="GHEA Grapalat" w:hAnsi="GHEA Grapalat"/>
-          <w:bCs/>
+        <w:t xml:space="preserve">    </w:t>
+      </w:r>
+      <w:proofErr w:type="spellStart"/>
+      <w:r>
+        <w:rPr>
+          <w:rFonts w:ascii="GHEA Grapalat" w:hAnsi="GHEA Grapalat"/>
+          <w:bCs/>
+        </w:rPr>
+        <w:t>plt.show</w:t>
+      </w:r>
+      <w:proofErr w:type="spellEnd"/>
+      <w:r>
+        <w:rPr>
+          <w:rFonts w:ascii="GHEA Grapalat" w:hAnsi="GHEA Grapalat"/>
+          <w:bCs/>
+        </w:rPr>
+        <w:t>()</w:t>
+      </w:r>
+      <w:r>
+        <w:rPr>
+          <w:rFonts w:ascii="GHEA Grapalat" w:hAnsi="GHEA Grapalat"/>
+          <w:bCs/>
+        </w:rPr>
+        <w:br/>
+      </w:r>
+      <w:r>
+        <w:rPr>
+          <w:rFonts w:ascii="GHEA Grapalat" w:hAnsi="GHEA Grapalat"/>
+          <w:bCs/>
+        </w:rPr>
+        <w:br/>
+      </w:r>
+      <w:r>
+        <w:rPr>
+          <w:rFonts w:ascii="GHEA Grapalat" w:hAnsi="GHEA Grapalat"/>
+          <w:bCs/>
+        </w:rPr>
+        <w:br/>
+      </w:r>
+      <w:proofErr w:type="spellStart"/>
+      <w:r>
+        <w:rPr>
+          <w:rFonts w:ascii="GHEA Grapalat" w:hAnsi="GHEA Grapalat"/>
+          <w:bCs/>
+        </w:rPr>
+        <w:t>show_graph</w:t>
+      </w:r>
+      <w:proofErr w:type="spellEnd"/>
+      <w:r>
+        <w:rPr>
+          <w:rFonts w:ascii="GHEA Grapalat" w:hAnsi="GHEA Grapalat"/>
+          <w:bCs/>
+        </w:rPr>
+        <w:t>(G1, partition1, "</w:t>
+      </w:r>
+      <w:proofErr w:type="spellStart"/>
+      <w:r>
+        <w:rPr>
+          <w:rFonts w:ascii="GHEA Grapalat" w:hAnsi="GHEA Grapalat"/>
+          <w:bCs/>
+        </w:rPr>
+        <w:t>Ուղղորդված</w:t>
+      </w:r>
+      <w:proofErr w:type="spellEnd"/>
+      <w:r>
+        <w:rPr>
+          <w:rFonts w:ascii="GHEA Grapalat" w:hAnsi="GHEA Grapalat"/>
+          <w:bCs/>
+        </w:rPr>
+        <w:t>")</w:t>
+      </w:r>
+      <w:r>
+        <w:rPr>
+          <w:rFonts w:ascii="GHEA Grapalat" w:hAnsi="GHEA Grapalat"/>
+          <w:bCs/>
+        </w:rPr>
+        <w:br/>
+      </w:r>
+      <w:proofErr w:type="spellStart"/>
+      <w:r>
+        <w:rPr>
+          <w:rFonts w:ascii="GHEA Grapalat" w:hAnsi="GHEA Grapalat"/>
+          <w:bCs/>
+        </w:rPr>
+        <w:t>show_graph</w:t>
+      </w:r>
+      <w:proofErr w:type="spellEnd"/>
+      <w:r>
+        <w:rPr>
+          <w:rFonts w:ascii="GHEA Grapalat" w:hAnsi="GHEA Grapalat"/>
+          <w:bCs/>
+        </w:rPr>
+        <w:t>(G2, partition2, "</w:t>
+      </w:r>
+      <w:proofErr w:type="spellStart"/>
+      <w:r>
+        <w:rPr>
+          <w:rFonts w:ascii="GHEA Grapalat" w:hAnsi="GHEA Grapalat"/>
+          <w:bCs/>
+        </w:rPr>
+        <w:t>Ուղղորդված</w:t>
+      </w:r>
+      <w:proofErr w:type="spellEnd"/>
+      <w:r>
+        <w:rPr>
+          <w:rFonts w:ascii="GHEA Grapalat" w:hAnsi="GHEA Grapalat"/>
+          <w:bCs/>
+        </w:rPr>
+        <w:t xml:space="preserve"> </w:t>
+      </w:r>
+      <w:proofErr w:type="spellStart"/>
+      <w:r>
+        <w:rPr>
+          <w:rFonts w:ascii="GHEA Grapalat" w:hAnsi="GHEA Grapalat"/>
+          <w:bCs/>
+        </w:rPr>
+        <w:t>քաշով</w:t>
+      </w:r>
+      <w:proofErr w:type="spellEnd"/>
+      <w:r>
+        <w:rPr>
+          <w:rFonts w:ascii="GHEA Grapalat" w:hAnsi="GHEA Grapalat"/>
+          <w:bCs/>
+        </w:rPr>
+        <w:t>")</w:t>
+      </w:r>
+      <w:r>
+        <w:rPr>
+          <w:rFonts w:ascii="GHEA Grapalat" w:hAnsi="GHEA Grapalat"/>
+          <w:bCs/>
+        </w:rPr>
+        <w:br/>
+      </w:r>
+      <w:proofErr w:type="spellStart"/>
+      <w:r>
+        <w:rPr>
+          <w:rFonts w:ascii="GHEA Grapalat" w:hAnsi="GHEA Grapalat"/>
+          <w:bCs/>
+        </w:rPr>
+        <w:t>show_graph</w:t>
+      </w:r>
+      <w:proofErr w:type="spellEnd"/>
+      <w:r>
+        <w:rPr>
+          <w:rFonts w:ascii="GHEA Grapalat" w:hAnsi="GHEA Grapalat"/>
+          <w:bCs/>
+        </w:rPr>
+        <w:t>(G3, partition3, "</w:t>
+      </w:r>
+      <w:proofErr w:type="spellStart"/>
+      <w:r>
+        <w:rPr>
+          <w:rFonts w:ascii="GHEA Grapalat" w:hAnsi="GHEA Grapalat"/>
+          <w:bCs/>
+        </w:rPr>
+        <w:t>Ոչ</w:t>
+      </w:r>
+      <w:proofErr w:type="spellEnd"/>
+      <w:r>
+        <w:rPr>
+          <w:rFonts w:ascii="GHEA Grapalat" w:hAnsi="GHEA Grapalat"/>
+          <w:bCs/>
+        </w:rPr>
+        <w:t xml:space="preserve"> </w:t>
+      </w:r>
+      <w:proofErr w:type="spellStart"/>
+      <w:r>
+        <w:rPr>
+          <w:rFonts w:ascii="GHEA Grapalat" w:hAnsi="GHEA Grapalat"/>
+          <w:bCs/>
+        </w:rPr>
+        <w:t>ուղղորդված</w:t>
+      </w:r>
+      <w:proofErr w:type="spellEnd"/>
+      <w:r>
+        <w:rPr>
+          <w:rFonts w:ascii="GHEA Grapalat" w:hAnsi="GHEA Grapalat"/>
+          <w:bCs/>
+        </w:rPr>
+        <w:t>")</w:t>
+      </w:r>
+      <w:r>
+        <w:rPr>
+          <w:rFonts w:ascii="GHEA Grapalat" w:hAnsi="GHEA Grapalat"/>
+          <w:bCs/>
+        </w:rPr>
+        <w:br/>
+      </w:r>
+      <w:proofErr w:type="spellStart"/>
+      <w:r>
+        <w:rPr>
+          <w:rFonts w:ascii="GHEA Grapalat" w:hAnsi="GHEA Grapalat"/>
+          <w:bCs/>
+        </w:rPr>
+        <w:t>show_graph</w:t>
+      </w:r>
+      <w:proofErr w:type="spellEnd"/>
+      <w:r>
+        <w:rPr>
+          <w:rFonts w:ascii="GHEA Grapalat" w:hAnsi="GHEA Grapalat"/>
+          <w:bCs/>
+        </w:rPr>
+        <w:t>(G4, partition4, "</w:t>
+      </w:r>
+      <w:proofErr w:type="spellStart"/>
+      <w:r>
+        <w:rPr>
+          <w:rFonts w:ascii="GHEA Grapalat" w:hAnsi="GHEA Grapalat"/>
+          <w:bCs/>
+        </w:rPr>
+        <w:t>Ոչ</w:t>
+      </w:r>
+      <w:proofErr w:type="spellEnd"/>
+      <w:r>
+        <w:rPr>
+          <w:rFonts w:ascii="GHEA Grapalat" w:hAnsi="GHEA Grapalat"/>
+          <w:bCs/>
+        </w:rPr>
+        <w:t xml:space="preserve"> </w:t>
+      </w:r>
+      <w:proofErr w:type="spellStart"/>
+      <w:r>
+        <w:rPr>
+          <w:rFonts w:ascii="GHEA Grapalat" w:hAnsi="GHEA Grapalat"/>
+          <w:bCs/>
+        </w:rPr>
+        <w:t>ուղղորդված</w:t>
+      </w:r>
+      <w:proofErr w:type="spellEnd"/>
+      <w:r>
+        <w:rPr>
+          <w:rFonts w:ascii="GHEA Grapalat" w:hAnsi="GHEA Grapalat"/>
+          <w:bCs/>
+        </w:rPr>
+        <w:t xml:space="preserve"> </w:t>
+      </w:r>
+      <w:proofErr w:type="spellStart"/>
+      <w:r>
+        <w:rPr>
+          <w:rFonts w:ascii="GHEA Grapalat" w:hAnsi="GHEA Grapalat"/>
+          <w:bCs/>
+        </w:rPr>
+        <w:t>քաշով</w:t>
+      </w:r>
+      <w:proofErr w:type="spellEnd"/>
+      <w:r>
+        <w:rPr>
+          <w:rFonts w:ascii="GHEA Grapalat" w:hAnsi="GHEA Grapalat"/>
+          <w:bCs/>
+        </w:rPr>
+        <w:t>")</w:t>
+      </w:r>
+    </w:p>
+    <w:p>
+      <w:pPr>
+        <w:pStyle w:val="Heading1"/>
+        <w:numPr>
+          <w:ilvl w:val="1"/>
+          <w:numId w:val="25"/>
+        </w:numPr>
+        <w:rPr>
+          <w:sz w:val="28"/>
+          <w:szCs w:val="28"/>
+          <w:lang w:val="hy-AM"/>
+        </w:rPr>
+      </w:pPr>
+      <w:bookmarkStart w:id="9" w:name="_Toc224075151"/>
+      <w:r>
+        <w:rPr>
+          <w:sz w:val="28"/>
+          <w:szCs w:val="28"/>
+          <w:lang w:val="hy-AM"/>
+        </w:rPr>
+        <w:t>Տվյալներ գեներացնող սկրիպտեր</w:t>
+      </w:r>
+      <w:bookmarkEnd w:id="9"/>
+    </w:p>
+    <w:p>
+      <w:pPr>
+        <w:rPr>
+          <w:lang w:val="hy-AM"/>
+        </w:rPr>
+      </w:pPr>
+    </w:p>
+    <w:p>
+      <w:pPr>
+        <w:rPr>
+          <w:rFonts w:ascii="Sylfaen" w:hAnsi="Sylfaen"/>
+          <w:b/>
+          <w:bCs/>
+          <w:lang w:val="hy-AM"/>
+        </w:rPr>
+      </w:pPr>
+      <w:r>
+        <w:rPr>
+          <w:b/>
+          <w:bCs/>
+          <w:lang w:val="hy-AM"/>
+        </w:rPr>
+        <w:t>1</w:t>
+      </w:r>
+      <w:r>
+        <w:rPr>
+          <w:rFonts w:ascii="MS Gothic" w:eastAsia="MS Gothic" w:hAnsi="MS Gothic" w:cs="MS Gothic"/>
+          <w:b/>
+          <w:bCs/>
+          <w:lang w:val="hy-AM"/>
+        </w:rPr>
+        <w:t>․</w:t>
+      </w:r>
+      <w:r>
+        <w:rPr>
+          <w:b/>
+          <w:bCs/>
+          <w:lang w:val="hy-AM"/>
+        </w:rPr>
+        <w:t>undirected_weight</w:t>
+      </w:r>
+      <w:r>
+        <w:rPr>
+          <w:b/>
+          <w:bCs/>
+          <w:lang w:val="hy-AM"/>
+        </w:rPr>
+        <w:t xml:space="preserve"> </w:t>
+      </w:r>
+      <w:r>
+        <w:rPr>
+          <w:rFonts w:ascii="Sylfaen" w:hAnsi="Sylfaen"/>
+          <w:b/>
+          <w:bCs/>
+          <w:lang w:val="hy-AM"/>
+        </w:rPr>
+        <w:t>սյան գեներացման սկրիպտ</w:t>
+      </w:r>
+    </w:p>
+    <w:p>
+      <w:pPr>
+        <w:rPr>
+          <w:lang w:val="hy-AM"/>
+        </w:rPr>
+      </w:pPr>
+      <w:r>
+        <w:rPr>
+          <w:lang w:val="hy-AM"/>
+        </w:rPr>
+        <w:t>=LET(</w:t>
+      </w:r>
+    </w:p>
+    <w:p>
+      <w:pPr>
+        <w:rPr>
+          <w:lang w:val="hy-AM"/>
+        </w:rPr>
+      </w:pPr>
+      <w:r>
+        <w:rPr>
+          <w:lang w:val="hy-AM"/>
+        </w:rPr>
+        <w:t xml:space="preserve"> me, --A2,</w:t>
+      </w:r>
+    </w:p>
+    <w:p>
+      <w:pPr>
+        <w:rPr>
+          <w:lang w:val="hy-AM"/>
+        </w:rPr>
+      </w:pPr>
+      <w:r>
+        <w:rPr>
+          <w:lang w:val="hy-AM"/>
+        </w:rPr>
+        <w:t xml:space="preserve"> raw, SUBSTITUTE(H2," ",""),</w:t>
+      </w:r>
+    </w:p>
+    <w:p>
+      <w:pPr>
+        <w:rPr>
+          <w:lang w:val="hy-AM"/>
+        </w:rPr>
+      </w:pPr>
+      <w:r>
+        <w:rPr>
+          <w:lang w:val="hy-AM"/>
+        </w:rPr>
+        <w:t xml:space="preserve"> friends, TEXTSPLIT(raw, ","),</w:t>
+      </w:r>
+    </w:p>
+    <w:p>
+      <w:pPr>
+        <w:rPr>
+          <w:lang w:val="hy-AM"/>
+        </w:rPr>
+      </w:pPr>
+      <w:r>
+        <w:rPr>
+          <w:lang w:val="hy-AM"/>
+        </w:rPr>
+        <w:t xml:space="preserve"> weights, MAP(friends, LAMBDA(f,</w:t>
+      </w:r>
+    </w:p>
+    <w:p>
+      <w:pPr>
+        <w:rPr>
+          <w:lang w:val="hy-AM"/>
+        </w:rPr>
+      </w:pPr>
+      <w:r>
+        <w:rPr>
+          <w:lang w:val="hy-AM"/>
+        </w:rPr>
+        <w:t xml:space="preserve"> LET( fr, --f,</w:t>
+      </w:r>
+    </w:p>
+    <w:p>
+      <w:pPr>
+        <w:rPr>
+          <w:lang w:val="hy-AM"/>
+        </w:rPr>
+      </w:pPr>
+      <w:r>
+        <w:rPr>
+          <w:lang w:val="hy-AM"/>
+        </w:rPr>
+        <w:t xml:space="preserve"> lo, MIN(me, fr),</w:t>
+      </w:r>
+    </w:p>
+    <w:p>
+      <w:pPr>
+        <w:rPr>
+          <w:lang w:val="hy-AM"/>
+        </w:rPr>
+      </w:pPr>
+      <w:r>
+        <w:rPr>
+          <w:lang w:val="hy-AM"/>
+        </w:rPr>
+        <w:t xml:space="preserve"> hi, MAX(me, fr),</w:t>
+      </w:r>
+    </w:p>
+    <w:p>
+      <w:pPr>
+        <w:rPr>
+          <w:lang w:val="hy-AM"/>
+        </w:rPr>
+      </w:pPr>
+      <w:r>
+        <w:rPr>
+          <w:lang w:val="hy-AM"/>
+        </w:rPr>
+        <w:t xml:space="preserve"> MOD(ABS(lo*123457 + hi*89123), 11)</w:t>
+      </w:r>
+    </w:p>
+    <w:p>
+      <w:pPr>
+        <w:rPr>
+          <w:lang w:val="hy-AM"/>
+        </w:rPr>
+      </w:pPr>
+      <w:r>
+        <w:rPr>
+          <w:lang w:val="hy-AM"/>
+        </w:rPr>
+        <w:t xml:space="preserve"> )</w:t>
+      </w:r>
+    </w:p>
+    <w:p>
+      <w:pPr>
+        <w:rPr>
+          <w:lang w:val="hy-AM"/>
+        </w:rPr>
+      </w:pPr>
+      <w:r>
+        <w:rPr>
+          <w:lang w:val="hy-AM"/>
+        </w:rPr>
+        <w:t xml:space="preserve"> )),</w:t>
+      </w:r>
+    </w:p>
+    <w:p>
+      <w:pPr>
+        <w:rPr>
+          <w:lang w:val="hy-AM"/>
+        </w:rPr>
+      </w:pPr>
+      <w:r>
+        <w:rPr>
+          <w:lang w:val="hy-AM"/>
+        </w:rPr>
+        <w:t xml:space="preserve"> TEXTJOIN(",", TRUE, weights)</w:t>
+      </w:r>
+    </w:p>
+    <w:p>
+      <w:pPr>
+        <w:rPr>
+          <w:lang w:val="hy-AM"/>
+        </w:rPr>
+      </w:pPr>
+      <w:r>
+        <w:rPr>
+          <w:lang w:val="hy-AM"/>
+        </w:rPr>
+        <w:t xml:space="preserve"> )</w:t>
+      </w:r>
+    </w:p>
+    <w:p>
+      <w:pPr>
+        <w:rPr>
+          <w:lang w:val="hy-AM"/>
+        </w:rPr>
+      </w:pPr>
+    </w:p>
+    <w:p>
+      <w:pPr>
+        <w:rPr>
+          <w:b/>
+          <w:bCs/>
+          <w:lang w:val="hy-AM"/>
+        </w:rPr>
+      </w:pPr>
+    </w:p>
+    <w:p>
+      <w:pPr>
+        <w:rPr>
+          <w:b/>
+          <w:bCs/>
+          <w:lang w:val="hy-AM"/>
+        </w:rPr>
+      </w:pPr>
+    </w:p>
+    <w:p>
+      <w:pPr>
+        <w:rPr>
+          <w:rFonts w:ascii="Sylfaen" w:hAnsi="Sylfaen"/>
+          <w:b/>
+          <w:bCs/>
+          <w:lang w:val="hy-AM"/>
+        </w:rPr>
+      </w:pPr>
+      <w:r>
+        <w:rPr>
+          <w:b/>
+          <w:bCs/>
+          <w:lang w:val="hy-AM"/>
         </w:rPr>
         <w:lastRenderedPageBreak/>
-        <w:t xml:space="preserve">    </w:t>
-      </w:r>
-      <w:proofErr w:type="spellStart"/>
-      <w:r>
-        <w:rPr>
-          <w:rFonts w:ascii="GHEA Grapalat" w:hAnsi="GHEA Grapalat"/>
-          <w:bCs/>
-        </w:rPr>
-        <w:t>plt.show</w:t>
-      </w:r>
-      <w:proofErr w:type="spellEnd"/>
-      <w:r>
-        <w:rPr>
-          <w:rFonts w:ascii="GHEA Grapalat" w:hAnsi="GHEA Grapalat"/>
-          <w:bCs/>
-        </w:rPr>
-        <w:t>()</w:t>
-      </w:r>
-      <w:r>
-        <w:rPr>
-          <w:rFonts w:ascii="GHEA Grapalat" w:hAnsi="GHEA Grapalat"/>
-          <w:bCs/>
-        </w:rPr>
-        <w:br/>
-      </w:r>
-      <w:r>
-        <w:rPr>
-          <w:rFonts w:ascii="GHEA Grapalat" w:hAnsi="GHEA Grapalat"/>
-          <w:bCs/>
-        </w:rPr>
-        <w:br/>
-      </w:r>
-      <w:r>
-        <w:rPr>
-          <w:rFonts w:ascii="GHEA Grapalat" w:hAnsi="GHEA Grapalat"/>
-          <w:bCs/>
-        </w:rPr>
-        <w:br/>
-      </w:r>
-      <w:proofErr w:type="spellStart"/>
-      <w:r>
-        <w:rPr>
-          <w:rFonts w:ascii="GHEA Grapalat" w:hAnsi="GHEA Grapalat"/>
-          <w:bCs/>
-        </w:rPr>
-        <w:t>show_graph</w:t>
-      </w:r>
-      <w:proofErr w:type="spellEnd"/>
-      <w:r>
-        <w:rPr>
-          <w:rFonts w:ascii="GHEA Grapalat" w:hAnsi="GHEA Grapalat"/>
-          <w:bCs/>
-        </w:rPr>
-        <w:t>(G1, partition1, "</w:t>
-      </w:r>
-      <w:proofErr w:type="spellStart"/>
-      <w:r>
-        <w:rPr>
-          <w:rFonts w:ascii="GHEA Grapalat" w:hAnsi="GHEA Grapalat"/>
-          <w:bCs/>
-        </w:rPr>
-        <w:t>Ուղղորդված</w:t>
-      </w:r>
-      <w:proofErr w:type="spellEnd"/>
-      <w:r>
-        <w:rPr>
-          <w:rFonts w:ascii="GHEA Grapalat" w:hAnsi="GHEA Grapalat"/>
-          <w:bCs/>
-        </w:rPr>
-        <w:t>")</w:t>
-      </w:r>
-      <w:r>
-        <w:rPr>
-          <w:rFonts w:ascii="GHEA Grapalat" w:hAnsi="GHEA Grapalat"/>
-          <w:bCs/>
-        </w:rPr>
-        <w:br/>
-      </w:r>
-      <w:proofErr w:type="spellStart"/>
-      <w:r>
-        <w:rPr>
-          <w:rFonts w:ascii="GHEA Grapalat" w:hAnsi="GHEA Grapalat"/>
-          <w:bCs/>
-        </w:rPr>
-        <w:t>show_graph</w:t>
-      </w:r>
-      <w:proofErr w:type="spellEnd"/>
-      <w:r>
-        <w:rPr>
-          <w:rFonts w:ascii="GHEA Grapalat" w:hAnsi="GHEA Grapalat"/>
-          <w:bCs/>
-        </w:rPr>
-        <w:t>(G2, partition2, "</w:t>
-      </w:r>
-      <w:proofErr w:type="spellStart"/>
-      <w:r>
-        <w:rPr>
-          <w:rFonts w:ascii="GHEA Grapalat" w:hAnsi="GHEA Grapalat"/>
-          <w:bCs/>
-        </w:rPr>
-        <w:t>Ուղղորդված</w:t>
-      </w:r>
-      <w:proofErr w:type="spellEnd"/>
-      <w:r>
-        <w:rPr>
-          <w:rFonts w:ascii="GHEA Grapalat" w:hAnsi="GHEA Grapalat"/>
-          <w:bCs/>
-        </w:rPr>
-        <w:t xml:space="preserve"> </w:t>
-      </w:r>
-      <w:proofErr w:type="spellStart"/>
-      <w:r>
-        <w:rPr>
-          <w:rFonts w:ascii="GHEA Grapalat" w:hAnsi="GHEA Grapalat"/>
-          <w:bCs/>
-        </w:rPr>
-        <w:t>քաշով</w:t>
-      </w:r>
-      <w:proofErr w:type="spellEnd"/>
-      <w:r>
-        <w:rPr>
-          <w:rFonts w:ascii="GHEA Grapalat" w:hAnsi="GHEA Grapalat"/>
-          <w:bCs/>
-        </w:rPr>
-        <w:t>")</w:t>
-      </w:r>
-      <w:r>
-        <w:rPr>
-          <w:rFonts w:ascii="GHEA Grapalat" w:hAnsi="GHEA Grapalat"/>
-          <w:bCs/>
-        </w:rPr>
-        <w:br/>
-      </w:r>
-      <w:proofErr w:type="spellStart"/>
-      <w:r>
-        <w:rPr>
-          <w:rFonts w:ascii="GHEA Grapalat" w:hAnsi="GHEA Grapalat"/>
-          <w:bCs/>
-        </w:rPr>
-        <w:t>show_graph</w:t>
-      </w:r>
-      <w:proofErr w:type="spellEnd"/>
-      <w:r>
-        <w:rPr>
-          <w:rFonts w:ascii="GHEA Grapalat" w:hAnsi="GHEA Grapalat"/>
-          <w:bCs/>
-        </w:rPr>
-        <w:t>(G3, partition3, "</w:t>
-      </w:r>
-      <w:proofErr w:type="spellStart"/>
-      <w:r>
-        <w:rPr>
-          <w:rFonts w:ascii="GHEA Grapalat" w:hAnsi="GHEA Grapalat"/>
-          <w:bCs/>
-        </w:rPr>
-        <w:t>Ոչ</w:t>
-      </w:r>
-      <w:proofErr w:type="spellEnd"/>
-      <w:r>
-        <w:rPr>
-          <w:rFonts w:ascii="GHEA Grapalat" w:hAnsi="GHEA Grapalat"/>
-          <w:bCs/>
-        </w:rPr>
-        <w:t xml:space="preserve"> </w:t>
-      </w:r>
-      <w:proofErr w:type="spellStart"/>
-      <w:r>
-        <w:rPr>
-          <w:rFonts w:ascii="GHEA Grapalat" w:hAnsi="GHEA Grapalat"/>
-          <w:bCs/>
-        </w:rPr>
-        <w:t>ուղղորդված</w:t>
-      </w:r>
-      <w:proofErr w:type="spellEnd"/>
-      <w:r>
-        <w:rPr>
-          <w:rFonts w:ascii="GHEA Grapalat" w:hAnsi="GHEA Grapalat"/>
-          <w:bCs/>
-        </w:rPr>
-        <w:t>")</w:t>
-      </w:r>
-      <w:r>
-        <w:rPr>
-          <w:rFonts w:ascii="GHEA Grapalat" w:hAnsi="GHEA Grapalat"/>
-          <w:bCs/>
-        </w:rPr>
-        <w:br/>
-      </w:r>
-      <w:proofErr w:type="spellStart"/>
-      <w:r>
-        <w:rPr>
-          <w:rFonts w:ascii="GHEA Grapalat" w:hAnsi="GHEA Grapalat"/>
-          <w:bCs/>
-        </w:rPr>
-        <w:t>show_graph</w:t>
-      </w:r>
-      <w:proofErr w:type="spellEnd"/>
-      <w:r>
-        <w:rPr>
-          <w:rFonts w:ascii="GHEA Grapalat" w:hAnsi="GHEA Grapalat"/>
-          <w:bCs/>
-        </w:rPr>
-        <w:t>(G4, partition4, "</w:t>
-      </w:r>
-      <w:proofErr w:type="spellStart"/>
-      <w:r>
-        <w:rPr>
-          <w:rFonts w:ascii="GHEA Grapalat" w:hAnsi="GHEA Grapalat"/>
-          <w:bCs/>
-        </w:rPr>
-        <w:t>Ոչ</w:t>
-      </w:r>
-      <w:proofErr w:type="spellEnd"/>
-      <w:r>
-        <w:rPr>
-          <w:rFonts w:ascii="GHEA Grapalat" w:hAnsi="GHEA Grapalat"/>
-          <w:bCs/>
-        </w:rPr>
-        <w:t xml:space="preserve"> </w:t>
-      </w:r>
-      <w:proofErr w:type="spellStart"/>
-      <w:r>
-        <w:rPr>
-          <w:rFonts w:ascii="GHEA Grapalat" w:hAnsi="GHEA Grapalat"/>
-          <w:bCs/>
-        </w:rPr>
-        <w:t>ուղղորդված</w:t>
-      </w:r>
-      <w:proofErr w:type="spellEnd"/>
-      <w:r>
-        <w:rPr>
-          <w:rFonts w:ascii="GHEA Grapalat" w:hAnsi="GHEA Grapalat"/>
-          <w:bCs/>
-        </w:rPr>
-        <w:t xml:space="preserve"> </w:t>
-      </w:r>
-      <w:proofErr w:type="spellStart"/>
-      <w:r>
-        <w:rPr>
-          <w:rFonts w:ascii="GHEA Grapalat" w:hAnsi="GHEA Grapalat"/>
-          <w:bCs/>
-        </w:rPr>
-        <w:t>քաշով</w:t>
-      </w:r>
-      <w:proofErr w:type="spellEnd"/>
-      <w:r>
-        <w:rPr>
-          <w:rFonts w:ascii="GHEA Grapalat" w:hAnsi="GHEA Grapalat"/>
-          <w:bCs/>
-        </w:rPr>
-        <w:t>")</w:t>
-      </w:r>
+        <w:t>2</w:t>
+      </w:r>
+      <w:r>
+        <w:rPr>
+          <w:rFonts w:ascii="MS Gothic" w:eastAsia="MS Gothic" w:hAnsi="MS Gothic" w:cs="MS Gothic"/>
+          <w:b/>
+          <w:bCs/>
+          <w:lang w:val="hy-AM"/>
+        </w:rPr>
+        <w:t>․</w:t>
+      </w:r>
+      <w:r>
+        <w:rPr>
+          <w:b/>
+          <w:bCs/>
+          <w:lang w:val="hy-AM"/>
+        </w:rPr>
+        <w:t>undirected_friends_ids</w:t>
+      </w:r>
+      <w:r>
+        <w:rPr>
+          <w:b/>
+          <w:bCs/>
+          <w:lang w:val="hy-AM"/>
+        </w:rPr>
+        <w:t xml:space="preserve"> </w:t>
+      </w:r>
+      <w:r>
+        <w:rPr>
+          <w:rFonts w:ascii="Sylfaen" w:hAnsi="Sylfaen"/>
+          <w:b/>
+          <w:bCs/>
+          <w:lang w:val="hy-AM"/>
+        </w:rPr>
+        <w:t>սյան գեներացման սկրիպտ</w:t>
+      </w:r>
+    </w:p>
+    <w:p>
+      <w:pPr>
+        <w:rPr>
+          <w:rFonts w:ascii="Sylfaen" w:hAnsi="Sylfaen"/>
+          <w:lang w:val="hy-AM"/>
+        </w:rPr>
+      </w:pPr>
+      <w:r>
+        <w:rPr>
+          <w:rFonts w:ascii="Sylfaen" w:hAnsi="Sylfaen"/>
+          <w:lang w:val="hy-AM"/>
+        </w:rPr>
+        <w:t>=LET(</w:t>
+      </w:r>
+    </w:p>
+    <w:p>
+      <w:pPr>
+        <w:rPr>
+          <w:rFonts w:ascii="Sylfaen" w:hAnsi="Sylfaen"/>
+          <w:lang w:val="hy-AM"/>
+        </w:rPr>
+      </w:pPr>
+      <w:r>
+        <w:rPr>
+          <w:rFonts w:ascii="Sylfaen" w:hAnsi="Sylfaen"/>
+          <w:lang w:val="hy-AM"/>
+        </w:rPr>
+        <w:t xml:space="preserve"> myID, TEXT($A2,"0"),</w:t>
+      </w:r>
+    </w:p>
+    <w:p>
+      <w:pPr>
+        <w:rPr>
+          <w:rFonts w:ascii="Sylfaen" w:hAnsi="Sylfaen"/>
+          <w:lang w:val="hy-AM"/>
+        </w:rPr>
+      </w:pPr>
+      <w:r>
+        <w:rPr>
+          <w:rFonts w:ascii="Sylfaen" w:hAnsi="Sylfaen"/>
+          <w:lang w:val="hy-AM"/>
+        </w:rPr>
+        <w:t xml:space="preserve"> ids, $A$2:$A$102,</w:t>
+      </w:r>
+    </w:p>
+    <w:p>
+      <w:pPr>
+        <w:rPr>
+          <w:rFonts w:ascii="Sylfaen" w:hAnsi="Sylfaen"/>
+          <w:lang w:val="hy-AM"/>
+        </w:rPr>
+      </w:pPr>
+      <w:r>
+        <w:rPr>
+          <w:rFonts w:ascii="Sylfaen" w:hAnsi="Sylfaen"/>
+          <w:lang w:val="hy-AM"/>
+        </w:rPr>
+        <w:t xml:space="preserve"> friendsCol, $F$2:$F$102,</w:t>
+      </w:r>
+    </w:p>
+    <w:p>
+      <w:pPr>
+        <w:rPr>
+          <w:rFonts w:ascii="Sylfaen" w:hAnsi="Sylfaen"/>
+          <w:lang w:val="hy-AM"/>
+        </w:rPr>
+      </w:pPr>
+      <w:r>
+        <w:rPr>
+          <w:rFonts w:ascii="Sylfaen" w:hAnsi="Sylfaen"/>
+          <w:lang w:val="hy-AM"/>
+        </w:rPr>
+        <w:t xml:space="preserve"> rowIdx, ROW($A2)-ROW($A$2)+1,</w:t>
+      </w:r>
+    </w:p>
+    <w:p>
+      <w:pPr>
+        <w:rPr>
+          <w:rFonts w:ascii="Sylfaen" w:hAnsi="Sylfaen"/>
+          <w:lang w:val="hy-AM"/>
+        </w:rPr>
+      </w:pPr>
+      <w:r>
+        <w:rPr>
+          <w:rFonts w:ascii="Sylfaen" w:hAnsi="Sylfaen"/>
+          <w:lang w:val="hy-AM"/>
+        </w:rPr>
+        <w:t xml:space="preserve"> rowFriendsCell, INDEX(friendsCol, rowIdx),</w:t>
+      </w:r>
+    </w:p>
+    <w:p>
+      <w:pPr>
+        <w:rPr>
+          <w:rFonts w:ascii="Sylfaen" w:hAnsi="Sylfaen"/>
+          <w:lang w:val="hy-AM"/>
+        </w:rPr>
+      </w:pPr>
+      <w:r>
+        <w:rPr>
+          <w:rFonts w:ascii="Sylfaen" w:hAnsi="Sylfaen"/>
+          <w:lang w:val="hy-AM"/>
+        </w:rPr>
+        <w:t xml:space="preserve"> directFriends, IF(rowFriendsCell="", "", TEXTSPLIT(rowFriendsCell, ",")),</w:t>
+      </w:r>
+    </w:p>
+    <w:p>
+      <w:pPr>
+        <w:rPr>
+          <w:rFonts w:ascii="Sylfaen" w:hAnsi="Sylfaen"/>
+          <w:lang w:val="hy-AM"/>
+        </w:rPr>
+      </w:pPr>
+      <w:r>
+        <w:rPr>
+          <w:rFonts w:ascii="Sylfaen" w:hAnsi="Sylfaen"/>
+          <w:lang w:val="hy-AM"/>
+        </w:rPr>
+        <w:t xml:space="preserve"> reverseMask, BYROW(friendsCol, LAMBDA(r,</w:t>
+      </w:r>
+    </w:p>
+    <w:p>
+      <w:pPr>
+        <w:rPr>
+          <w:rFonts w:ascii="Sylfaen" w:hAnsi="Sylfaen"/>
+          <w:lang w:val="hy-AM"/>
+        </w:rPr>
+      </w:pPr>
+      <w:r>
+        <w:rPr>
+          <w:rFonts w:ascii="Sylfaen" w:hAnsi="Sylfaen"/>
+          <w:lang w:val="hy-AM"/>
+        </w:rPr>
+        <w:t xml:space="preserve">   IF(r="",</w:t>
+      </w:r>
+    </w:p>
+    <w:p>
+      <w:pPr>
+        <w:rPr>
+          <w:rFonts w:ascii="Sylfaen" w:hAnsi="Sylfaen"/>
+          <w:lang w:val="hy-AM"/>
+        </w:rPr>
+      </w:pPr>
+      <w:r>
+        <w:rPr>
+          <w:rFonts w:ascii="Sylfaen" w:hAnsi="Sylfaen"/>
+          <w:lang w:val="hy-AM"/>
+        </w:rPr>
+        <w:t xml:space="preserve">      FALSE,</w:t>
+      </w:r>
+    </w:p>
+    <w:p>
+      <w:pPr>
+        <w:rPr>
+          <w:rFonts w:ascii="Sylfaen" w:hAnsi="Sylfaen"/>
+          <w:lang w:val="hy-AM"/>
+        </w:rPr>
+      </w:pPr>
+      <w:r>
+        <w:rPr>
+          <w:rFonts w:ascii="Sylfaen" w:hAnsi="Sylfaen"/>
+          <w:lang w:val="hy-AM"/>
+        </w:rPr>
+        <w:t xml:space="preserve">      LET(arr, TEXTSPLIT(r, ","), SUM(--(TRIM(arr)=myID))&gt;0)</w:t>
+      </w:r>
+    </w:p>
+    <w:p>
+      <w:pPr>
+        <w:rPr>
+          <w:rFonts w:ascii="Sylfaen" w:hAnsi="Sylfaen"/>
+          <w:lang w:val="hy-AM"/>
+        </w:rPr>
+      </w:pPr>
+      <w:r>
+        <w:rPr>
+          <w:rFonts w:ascii="Sylfaen" w:hAnsi="Sylfaen"/>
+          <w:lang w:val="hy-AM"/>
+        </w:rPr>
+        <w:t xml:space="preserve">   )</w:t>
+      </w:r>
+    </w:p>
+    <w:p>
+      <w:pPr>
+        <w:rPr>
+          <w:rFonts w:ascii="Sylfaen" w:hAnsi="Sylfaen"/>
+          <w:lang w:val="hy-AM"/>
+        </w:rPr>
+      </w:pPr>
+      <w:r>
+        <w:rPr>
+          <w:rFonts w:ascii="Sylfaen" w:hAnsi="Sylfaen"/>
+          <w:lang w:val="hy-AM"/>
+        </w:rPr>
+        <w:t xml:space="preserve"> )),</w:t>
+      </w:r>
+    </w:p>
+    <w:p>
+      <w:pPr>
+        <w:rPr>
+          <w:rFonts w:ascii="Sylfaen" w:hAnsi="Sylfaen"/>
+          <w:lang w:val="hy-AM"/>
+        </w:rPr>
+      </w:pPr>
+      <w:r>
+        <w:rPr>
+          <w:rFonts w:ascii="Sylfaen" w:hAnsi="Sylfaen"/>
+          <w:lang w:val="hy-AM"/>
+        </w:rPr>
+        <w:t xml:space="preserve"> reverseFriends, IFERROR(FILTER(ids, reverseMask), ""),</w:t>
+      </w:r>
+    </w:p>
+    <w:p>
+      <w:pPr>
+        <w:rPr>
+          <w:rFonts w:ascii="Sylfaen" w:hAnsi="Sylfaen"/>
+          <w:lang w:val="hy-AM"/>
+        </w:rPr>
+      </w:pPr>
+      <w:r>
+        <w:rPr>
+          <w:rFonts w:ascii="Sylfaen" w:hAnsi="Sylfaen"/>
+          <w:lang w:val="hy-AM"/>
+        </w:rPr>
+        <w:t xml:space="preserve"> allFriends, UNIQUE(VSTACK(directFriends, reverseFriends)),</w:t>
+      </w:r>
+    </w:p>
+    <w:p>
+      <w:pPr>
+        <w:rPr>
+          <w:rFonts w:ascii="Sylfaen" w:hAnsi="Sylfaen"/>
+          <w:lang w:val="hy-AM"/>
+        </w:rPr>
+      </w:pPr>
+      <w:r>
+        <w:rPr>
+          <w:rFonts w:ascii="Sylfaen" w:hAnsi="Sylfaen"/>
+          <w:lang w:val="hy-AM"/>
+        </w:rPr>
+        <w:t xml:space="preserve"> cleaned, IFERROR(FILTER(allFriends, allFriends&lt;&gt;""), ""),</w:t>
+      </w:r>
+    </w:p>
+    <w:p>
+      <w:pPr>
+        <w:rPr>
+          <w:rFonts w:ascii="Sylfaen" w:hAnsi="Sylfaen"/>
+          <w:lang w:val="hy-AM"/>
+        </w:rPr>
+      </w:pPr>
+      <w:r>
+        <w:rPr>
+          <w:rFonts w:ascii="Sylfaen" w:hAnsi="Sylfaen"/>
+          <w:lang w:val="hy-AM"/>
+        </w:rPr>
+        <w:t xml:space="preserve"> TEXTJOIN(",", TRUE, cleaned)</w:t>
+      </w:r>
+    </w:p>
+    <w:p>
+      <w:pPr>
+        <w:rPr>
+          <w:rFonts w:ascii="Sylfaen" w:hAnsi="Sylfaen"/>
+          <w:lang w:val="hy-AM"/>
+        </w:rPr>
+      </w:pPr>
+      <w:r>
+        <w:rPr>
+          <w:rFonts w:ascii="Sylfaen" w:hAnsi="Sylfaen"/>
+          <w:lang w:val="hy-AM"/>
+        </w:rPr>
+        <w:t>)</w:t>
+      </w:r>
+    </w:p>
+    <w:p>
+      <w:pPr>
+        <w:rPr>
+          <w:rFonts w:ascii="Sylfaen" w:hAnsi="Sylfaen"/>
+          <w:b/>
+          <w:bCs/>
+          <w:lang w:val="hy-AM"/>
+        </w:rPr>
+      </w:pPr>
+      <w:r>
+        <w:rPr>
+          <w:b/>
+          <w:bCs/>
+          <w:lang w:val="hy-AM"/>
+        </w:rPr>
+        <w:t>3</w:t>
+      </w:r>
+      <w:r>
+        <w:rPr>
+          <w:rFonts w:ascii="MS Gothic" w:eastAsia="MS Gothic" w:hAnsi="MS Gothic" w:cs="MS Gothic"/>
+          <w:b/>
+          <w:bCs/>
+          <w:lang w:val="hy-AM"/>
+        </w:rPr>
+        <w:t>․</w:t>
+      </w:r>
+      <w:r>
+        <w:rPr>
+          <w:b/>
+          <w:bCs/>
+          <w:lang w:val="hy-AM"/>
+        </w:rPr>
+        <w:t xml:space="preserve"> weights</w:t>
+      </w:r>
+      <w:r>
+        <w:rPr>
+          <w:b/>
+          <w:bCs/>
+          <w:lang w:val="hy-AM"/>
+        </w:rPr>
+        <w:t xml:space="preserve"> </w:t>
+      </w:r>
+      <w:r>
+        <w:rPr>
+          <w:rFonts w:ascii="Sylfaen" w:hAnsi="Sylfaen"/>
+          <w:b/>
+          <w:bCs/>
+          <w:lang w:val="hy-AM"/>
+        </w:rPr>
+        <w:t>սյան գեներացման սկրիպտ</w:t>
+      </w:r>
+    </w:p>
+    <w:p>
+      <w:pPr>
+        <w:rPr>
+          <w:rFonts w:ascii="Sylfaen" w:hAnsi="Sylfaen"/>
+          <w:lang w:val="hy-AM"/>
+        </w:rPr>
+      </w:pPr>
+      <w:r>
+        <w:rPr>
+          <w:rFonts w:ascii="Sylfaen" w:hAnsi="Sylfaen"/>
+          <w:lang w:val="hy-AM"/>
+        </w:rPr>
+        <w:t>=LET(</w:t>
+      </w:r>
+    </w:p>
+    <w:p>
+      <w:pPr>
+        <w:rPr>
+          <w:rFonts w:ascii="Sylfaen" w:hAnsi="Sylfaen"/>
+          <w:lang w:val="hy-AM"/>
+        </w:rPr>
+      </w:pPr>
+      <w:r>
+        <w:rPr>
+          <w:rFonts w:ascii="Sylfaen" w:hAnsi="Sylfaen"/>
+          <w:lang w:val="hy-AM"/>
+        </w:rPr>
+        <w:t xml:space="preserve"> friends, TEXTSPLIT(F2, ","),</w:t>
+      </w:r>
+    </w:p>
+    <w:p>
+      <w:pPr>
+        <w:rPr>
+          <w:rFonts w:ascii="Sylfaen" w:hAnsi="Sylfaen"/>
+          <w:lang w:val="hy-AM"/>
+        </w:rPr>
+      </w:pPr>
+      <w:r>
+        <w:rPr>
+          <w:rFonts w:ascii="Sylfaen" w:hAnsi="Sylfaen"/>
+          <w:lang w:val="hy-AM"/>
+        </w:rPr>
+        <w:t xml:space="preserve"> count, ROWS(friends),</w:t>
+      </w:r>
+    </w:p>
+    <w:p>
+      <w:pPr>
+        <w:rPr>
+          <w:rFonts w:ascii="Sylfaen" w:hAnsi="Sylfaen"/>
+          <w:lang w:val="hy-AM"/>
+        </w:rPr>
+      </w:pPr>
+      <w:r>
+        <w:rPr>
+          <w:rFonts w:ascii="Sylfaen" w:hAnsi="Sylfaen"/>
+          <w:lang w:val="hy-AM"/>
+        </w:rPr>
+        <w:t xml:space="preserve"> weights, MAKEARRAY(count,1,LAMBDA(r,c,RANDBETWEEN(0,3))),</w:t>
+      </w:r>
+    </w:p>
+    <w:p>
+      <w:pPr>
+        <w:rPr>
+          <w:rFonts w:ascii="Sylfaen" w:hAnsi="Sylfaen"/>
+          <w:lang w:val="hy-AM"/>
+        </w:rPr>
+      </w:pPr>
+      <w:r>
+        <w:rPr>
+          <w:rFonts w:ascii="Sylfaen" w:hAnsi="Sylfaen"/>
+          <w:lang w:val="hy-AM"/>
+        </w:rPr>
+        <w:t xml:space="preserve"> TEXTJOIN(",", TRUE, weights)</w:t>
+      </w:r>
+    </w:p>
+    <w:p>
+      <w:pPr>
+        <w:rPr>
+          <w:rFonts w:ascii="Sylfaen" w:hAnsi="Sylfaen"/>
+          <w:lang w:val="hy-AM"/>
+        </w:rPr>
+      </w:pPr>
+      <w:r>
+        <w:rPr>
+          <w:rFonts w:ascii="Sylfaen" w:hAnsi="Sylfaen"/>
+          <w:lang w:val="hy-AM"/>
+        </w:rPr>
+        <w:t>)</w:t>
+      </w:r>
+    </w:p>
+    <w:p>
+      <w:pPr>
+        <w:rPr>
+          <w:b/>
+          <w:bCs/>
+          <w:lang w:val="hy-AM"/>
+        </w:rPr>
+      </w:pPr>
+    </w:p>
+    <w:p>
+      <w:pPr>
+        <w:rPr>
+          <w:rFonts w:ascii="Sylfaen" w:hAnsi="Sylfaen"/>
+          <w:b/>
+          <w:bCs/>
+          <w:lang w:val="hy-AM"/>
+        </w:rPr>
+      </w:pPr>
+      <w:r>
+        <w:rPr>
+          <w:b/>
+          <w:bCs/>
+          <w:lang w:val="hy-AM"/>
+        </w:rPr>
+        <w:lastRenderedPageBreak/>
+        <w:t>4</w:t>
+      </w:r>
+      <w:r>
+        <w:rPr>
+          <w:rFonts w:ascii="MS Gothic" w:eastAsia="MS Gothic" w:hAnsi="MS Gothic" w:cs="MS Gothic"/>
+          <w:b/>
+          <w:bCs/>
+          <w:lang w:val="hy-AM"/>
+        </w:rPr>
+        <w:t>․</w:t>
+      </w:r>
+      <w:r>
+        <w:rPr>
+          <w:b/>
+          <w:bCs/>
+          <w:lang w:val="hy-AM"/>
+        </w:rPr>
+        <w:t xml:space="preserve"> friends_ids</w:t>
+      </w:r>
+      <w:r>
+        <w:rPr>
+          <w:b/>
+          <w:bCs/>
+          <w:lang w:val="hy-AM"/>
+        </w:rPr>
+        <w:t xml:space="preserve"> </w:t>
+      </w:r>
+      <w:r>
+        <w:rPr>
+          <w:rFonts w:ascii="Sylfaen" w:hAnsi="Sylfaen"/>
+          <w:b/>
+          <w:bCs/>
+          <w:lang w:val="hy-AM"/>
+        </w:rPr>
+        <w:t>սյան գեներացման սկրիպտ</w:t>
+      </w:r>
+    </w:p>
+    <w:p>
+      <w:pPr>
+        <w:rPr>
+          <w:rFonts w:ascii="Sylfaen" w:hAnsi="Sylfaen"/>
+          <w:lang w:val="hy-AM"/>
+        </w:rPr>
+      </w:pPr>
+      <w:r>
+        <w:rPr>
+          <w:rFonts w:ascii="Sylfaen" w:hAnsi="Sylfaen"/>
+          <w:lang w:val="hy-AM"/>
+        </w:rPr>
+        <w:t>=LET(</w:t>
+      </w:r>
+    </w:p>
+    <w:p>
+      <w:pPr>
+        <w:rPr>
+          <w:rFonts w:ascii="Sylfaen" w:hAnsi="Sylfaen"/>
+          <w:lang w:val="hy-AM"/>
+        </w:rPr>
+      </w:pPr>
+      <w:r>
+        <w:rPr>
+          <w:rFonts w:ascii="Sylfaen" w:hAnsi="Sylfaen"/>
+          <w:lang w:val="hy-AM"/>
+        </w:rPr>
+        <w:t xml:space="preserve"> ids,$A$2:$A$102,</w:t>
+      </w:r>
+    </w:p>
+    <w:p>
+      <w:pPr>
+        <w:rPr>
+          <w:rFonts w:ascii="Sylfaen" w:hAnsi="Sylfaen"/>
+          <w:lang w:val="hy-AM"/>
+        </w:rPr>
+      </w:pPr>
+      <w:r>
+        <w:rPr>
+          <w:rFonts w:ascii="Sylfaen" w:hAnsi="Sylfaen"/>
+          <w:lang w:val="hy-AM"/>
+        </w:rPr>
+        <w:t xml:space="preserve"> current,A2,</w:t>
+      </w:r>
+    </w:p>
+    <w:p>
+      <w:pPr>
+        <w:rPr>
+          <w:rFonts w:ascii="Sylfaen" w:hAnsi="Sylfaen"/>
+          <w:lang w:val="hy-AM"/>
+        </w:rPr>
+      </w:pPr>
+      <w:r>
+        <w:rPr>
+          <w:rFonts w:ascii="Sylfaen" w:hAnsi="Sylfaen"/>
+          <w:lang w:val="hy-AM"/>
+        </w:rPr>
+        <w:t xml:space="preserve"> filtered,FILTER(ids,ids&lt;&gt;current),</w:t>
+      </w:r>
+    </w:p>
+    <w:p>
+      <w:pPr>
+        <w:rPr>
+          <w:rFonts w:ascii="Sylfaen" w:hAnsi="Sylfaen"/>
+          <w:lang w:val="hy-AM"/>
+        </w:rPr>
+      </w:pPr>
+      <w:r>
+        <w:rPr>
+          <w:rFonts w:ascii="Sylfaen" w:hAnsi="Sylfaen"/>
+          <w:lang w:val="hy-AM"/>
+        </w:rPr>
+        <w:t xml:space="preserve"> n,RANDBETWEEN(1,1),</w:t>
+      </w:r>
+    </w:p>
+    <w:p>
+      <w:pPr>
+        <w:rPr>
+          <w:rFonts w:ascii="Sylfaen" w:hAnsi="Sylfaen"/>
+          <w:lang w:val="hy-AM"/>
+        </w:rPr>
+      </w:pPr>
+      <w:r>
+        <w:rPr>
+          <w:rFonts w:ascii="Sylfaen" w:hAnsi="Sylfaen"/>
+          <w:lang w:val="hy-AM"/>
+        </w:rPr>
+        <w:t xml:space="preserve"> picked,TAKE(SORTBY(filtered,RANDARRAY(ROWS(filtered))),n),</w:t>
+      </w:r>
+    </w:p>
+    <w:p>
+      <w:pPr>
+        <w:rPr>
+          <w:rFonts w:ascii="Sylfaen" w:hAnsi="Sylfaen"/>
+          <w:lang w:val="hy-AM"/>
+        </w:rPr>
+      </w:pPr>
+      <w:r>
+        <w:rPr>
+          <w:rFonts w:ascii="Sylfaen" w:hAnsi="Sylfaen"/>
+          <w:lang w:val="hy-AM"/>
+        </w:rPr>
+        <w:t xml:space="preserve"> TEXTJOIN(",",TRUE,SORT(picked))</w:t>
+      </w:r>
+    </w:p>
+    <w:p>
+      <w:pPr>
+        <w:rPr>
+          <w:rFonts w:ascii="Sylfaen" w:hAnsi="Sylfaen"/>
+          <w:lang w:val="hy-AM"/>
+        </w:rPr>
+      </w:pPr>
+      <w:r>
+        <w:rPr>
+          <w:rFonts w:ascii="Sylfaen" w:hAnsi="Sylfaen"/>
+          <w:lang w:val="hy-AM"/>
+        </w:rPr>
+        <w:t>)</w:t>
+      </w:r>
+    </w:p>
+    <w:p>
+      <w:pPr>
+        <w:pStyle w:val="Heading1"/>
+        <w:rPr>
+          <w:rFonts w:eastAsia="Microsoft YaHei"/>
+          <w:sz w:val="28"/>
+          <w:szCs w:val="28"/>
+          <w:lang w:val="hy-AM"/>
+        </w:rPr>
+      </w:pPr>
+      <w:bookmarkStart w:id="10" w:name="_Toc224075152"/>
+      <w:r>
+        <w:rPr>
+          <w:sz w:val="28"/>
+          <w:szCs w:val="28"/>
+          <w:lang w:val="hy-AM"/>
+        </w:rPr>
+        <w:t>3</w:t>
+      </w:r>
+      <w:r>
+        <w:rPr>
+          <w:rFonts w:ascii="MS Mincho" w:eastAsia="MS Mincho" w:hAnsi="MS Mincho" w:cs="MS Mincho" w:hint="eastAsia"/>
+          <w:sz w:val="28"/>
+          <w:szCs w:val="28"/>
+          <w:lang w:val="hy-AM"/>
+        </w:rPr>
+        <w:t>․</w:t>
+      </w:r>
+      <w:r>
+        <w:rPr>
+          <w:rFonts w:eastAsia="Microsoft YaHei"/>
+          <w:sz w:val="28"/>
+          <w:szCs w:val="28"/>
+          <w:lang w:val="hy-AM"/>
+        </w:rPr>
+        <w:t>3 Ծրագրային արտածում</w:t>
+      </w:r>
+      <w:bookmarkEnd w:id="10"/>
+    </w:p>
+    <w:p>
+      <w:pPr>
+        <w:rPr>
+          <w:rFonts w:ascii="Sylfaen" w:hAnsi="Sylfaen"/>
+          <w:lang w:val="hy-AM"/>
+        </w:rPr>
+      </w:pPr>
+    </w:p>
+    <w:p>
+      <w:pPr>
+        <w:rPr>
+          <w:rFonts w:ascii="Sylfaen" w:hAnsi="Sylfaen"/>
+          <w:lang w:val="hy-AM"/>
+        </w:rPr>
+      </w:pPr>
     </w:p>
     <w:p>
       <w:pPr>
@@ -35379,6 +36879,7 @@
         <w:rPr>
           <w:rFonts w:ascii="GHEA Grapalat" w:hAnsi="GHEA Grapalat"/>
           <w:b/>
+          <w:lang w:val="hy-AM"/>
         </w:rPr>
       </w:pPr>
     </w:p>
@@ -35527,7 +37028,6 @@
           <w:noProof/>
           <w:lang w:val="hy-AM"/>
         </w:rPr>
-        <w:lastRenderedPageBreak/>
         <w:drawing>
           <wp:inline distT="0" distB="0" distL="0" distR="0" wp14:anchorId="1BE02A80" wp14:editId="77CE3133">
             <wp:extent cx="5536286" cy="2996996"/>
@@ -35751,7 +37251,6 @@
           <w:noProof/>
           <w:lang w:val="hy-AM"/>
         </w:rPr>
-        <w:lastRenderedPageBreak/>
         <w:drawing>
           <wp:inline distT="0" distB="0" distL="0" distR="0" wp14:anchorId="112B307F" wp14:editId="67E484CF">
             <wp:extent cx="5727028" cy="3205276"/>
@@ -35975,7 +37474,6 @@
           <w:noProof/>
           <w:lang w:val="hy-AM"/>
         </w:rPr>
-        <w:lastRenderedPageBreak/>
         <w:drawing>
           <wp:inline distT="0" distB="0" distL="0" distR="0" wp14:anchorId="60153BA6" wp14:editId="6D781AE8">
             <wp:extent cx="5695072" cy="3223917"/>
@@ -36160,7 +37658,6 @@
     <w:p>
       <w:pPr>
         <w:spacing w:line="360" w:lineRule="auto"/>
-        <w:ind w:firstLine="340"/>
         <w:jc w:val="both"/>
         <w:rPr>
           <w:rFonts w:ascii="GHEA Grapalat" w:hAnsi="GHEA Grapalat"/>
@@ -36180,6 +37677,14 @@
           <w:lang w:val="hy-AM"/>
         </w:rPr>
       </w:pPr>
+      <w:r>
+        <w:rPr>
+          <w:rFonts w:ascii="GHEA Grapalat" w:hAnsi="GHEA Grapalat"/>
+          <w:b/>
+          <w:lang w:val="hy-AM"/>
+        </w:rPr>
+        <w:t>Ուղղորդված</w:t>
+      </w:r>
     </w:p>
     <w:p>
       <w:pPr>
@@ -36188,18 +37693,17 @@
         <w:jc w:val="both"/>
         <w:rPr>
           <w:rFonts w:ascii="GHEA Grapalat" w:hAnsi="GHEA Grapalat"/>
-          <w:b/>
-          <w:lang w:val="hy-AM"/>
-        </w:rPr>
-      </w:pPr>
-      <w:r>
-        <w:rPr>
-          <w:rFonts w:ascii="GHEA Grapalat" w:hAnsi="GHEA Grapalat"/>
-          <w:b/>
-          <w:lang w:val="hy-AM"/>
-        </w:rPr>
-        <w:lastRenderedPageBreak/>
-        <w:t>Ուղղորդված</w:t>
+          <w:bCs/>
+          <w:lang w:val="hy-AM"/>
+        </w:rPr>
+      </w:pPr>
+      <w:r>
+        <w:rPr>
+          <w:rFonts w:ascii="GHEA Grapalat" w:hAnsi="GHEA Grapalat"/>
+          <w:bCs/>
+          <w:lang w:val="hy-AM"/>
+        </w:rPr>
+        <w:t>Համայնք 0 (size=11): [1, 15, 2, 9, 49, 16, 70, 74, 73, 80, 86]</w:t>
       </w:r>
     </w:p>
     <w:p>
@@ -36213,6 +37717,14 @@
           <w:lang w:val="hy-AM"/>
         </w:rPr>
       </w:pPr>
+      <w:r>
+        <w:rPr>
+          <w:rFonts w:ascii="GHEA Grapalat" w:hAnsi="GHEA Grapalat"/>
+          <w:bCs/>
+          <w:lang w:val="hy-AM"/>
+        </w:rPr>
+        <w:t>Համայնք 1 (size=11): [3, 55, 26, 100, 35, 39, 53, 61, 57, 67, 68]</w:t>
+      </w:r>
     </w:p>
     <w:p>
       <w:pPr>
@@ -36231,7 +37743,7 @@
           <w:bCs/>
           <w:lang w:val="hy-AM"/>
         </w:rPr>
-        <w:t>Համայնք 0 (size=11): [1, 15, 2, 9, 49, 16, 70, 74, 73, 80, 86]</w:t>
+        <w:t>Համայնք 2 (size=10): [4, 23, 14, 72, 27, 99, 38, 45, 84, 87]</w:t>
       </w:r>
     </w:p>
     <w:p>
@@ -36251,7 +37763,7 @@
           <w:bCs/>
           <w:lang w:val="hy-AM"/>
         </w:rPr>
-        <w:t>Համայնք 1 (size=11): [3, 55, 26, 100, 35, 39, 53, 61, 57, 67, 68]</w:t>
+        <w:t>Համայնք 7 (size=9): [5, 13, 12, 19, 90, 42, 85, 48, 91]</w:t>
       </w:r>
     </w:p>
     <w:p>
@@ -36271,7 +37783,7 @@
           <w:bCs/>
           <w:lang w:val="hy-AM"/>
         </w:rPr>
-        <w:t>Համայնք 2 (size=10): [4, 23, 14, 72, 27, 99, 38, 45, 84, 87]</w:t>
+        <w:t>Համայնք 4 (size=10): [6, 78, 8, 66, 92, 11, 17, 43, 64, 88]</w:t>
       </w:r>
     </w:p>
     <w:p>
@@ -36291,7 +37803,7 @@
           <w:bCs/>
           <w:lang w:val="hy-AM"/>
         </w:rPr>
-        <w:t>Համայնք 7 (size=9): [5, 13, 12, 19, 90, 42, 85, 48, 91]</w:t>
+        <w:t>Համայնք 6 (size=7): [7, 79, 63, 25, 58, 77, 98]</w:t>
       </w:r>
     </w:p>
     <w:p>
@@ -36311,7 +37823,7 @@
           <w:bCs/>
           <w:lang w:val="hy-AM"/>
         </w:rPr>
-        <w:t>Համայնք 4 (size=10): [6, 78, 8, 66, 92, 11, 17, 43, 64, 88]</w:t>
+        <w:t>Համայնք 3 (size=9): [10, 29, 93, 30, 32, 69, 33, 96, 44]</w:t>
       </w:r>
     </w:p>
     <w:p>
@@ -36331,7 +37843,7 @@
           <w:bCs/>
           <w:lang w:val="hy-AM"/>
         </w:rPr>
-        <w:t>Համայնք 6 (size=7): [7, 79, 63, 25, 58, 77, 98]</w:t>
+        <w:t>Համայնք 8 (size=14): [18, 46, 21, 81, 22, 40, 24, 47, 37, 97, 51, 59, 65, 82]</w:t>
       </w:r>
     </w:p>
     <w:p>
@@ -36351,7 +37863,7 @@
           <w:bCs/>
           <w:lang w:val="hy-AM"/>
         </w:rPr>
-        <w:t>Համայնք 3 (size=9): [10, 29, 93, 30, 32, 69, 33, 96, 44]</w:t>
+        <w:t>Համայնք 9 (size=11): [20, 89, 28, 56, 50, 54, 52, 60, 62, 71, 76]</w:t>
       </w:r>
     </w:p>
     <w:p>
@@ -36371,7 +37883,7 @@
           <w:bCs/>
           <w:lang w:val="hy-AM"/>
         </w:rPr>
-        <w:t>Համայնք 8 (size=14): [18, 46, 21, 81, 22, 40, 24, 47, 37, 97, 51, 59, 65, 82]</w:t>
+        <w:t>Համայնք 5 (size=8): [31, 34, 95, 36, 41, 94, 75, 83]</w:t>
       </w:r>
     </w:p>
     <w:p>
@@ -36381,18 +37893,10 @@
         <w:jc w:val="both"/>
         <w:rPr>
           <w:rFonts w:ascii="GHEA Grapalat" w:hAnsi="GHEA Grapalat"/>
-          <w:bCs/>
-          <w:lang w:val="hy-AM"/>
-        </w:rPr>
-      </w:pPr>
-      <w:r>
-        <w:rPr>
-          <w:rFonts w:ascii="GHEA Grapalat" w:hAnsi="GHEA Grapalat"/>
-          <w:bCs/>
-          <w:lang w:val="hy-AM"/>
-        </w:rPr>
-        <w:t>Համայնք 9 (size=11): [20, 89, 28, 56, 50, 54, 52, 60, 62, 71, 76]</w:t>
-      </w:r>
+          <w:b/>
+          <w:lang w:val="hy-AM"/>
+        </w:rPr>
+      </w:pPr>
     </w:p>
     <w:p>
       <w:pPr>
@@ -36401,17 +37905,17 @@
         <w:jc w:val="both"/>
         <w:rPr>
           <w:rFonts w:ascii="GHEA Grapalat" w:hAnsi="GHEA Grapalat"/>
-          <w:bCs/>
-          <w:lang w:val="hy-AM"/>
-        </w:rPr>
-      </w:pPr>
-      <w:r>
-        <w:rPr>
-          <w:rFonts w:ascii="GHEA Grapalat" w:hAnsi="GHEA Grapalat"/>
-          <w:bCs/>
-          <w:lang w:val="hy-AM"/>
-        </w:rPr>
-        <w:t>Համայնք 5 (size=8): [31, 34, 95, 36, 41, 94, 75, 83]</w:t>
+          <w:b/>
+          <w:lang w:val="hy-AM"/>
+        </w:rPr>
+      </w:pPr>
+      <w:r>
+        <w:rPr>
+          <w:rFonts w:ascii="GHEA Grapalat" w:hAnsi="GHEA Grapalat"/>
+          <w:b/>
+          <w:lang w:val="hy-AM"/>
+        </w:rPr>
+        <w:t>Ուղղորդված քաշով</w:t>
       </w:r>
     </w:p>
     <w:p>
@@ -36421,10 +37925,18 @@
         <w:jc w:val="both"/>
         <w:rPr>
           <w:rFonts w:ascii="GHEA Grapalat" w:hAnsi="GHEA Grapalat"/>
-          <w:b/>
-          <w:lang w:val="hy-AM"/>
-        </w:rPr>
-      </w:pPr>
+          <w:bCs/>
+          <w:lang w:val="hy-AM"/>
+        </w:rPr>
+      </w:pPr>
+      <w:r>
+        <w:rPr>
+          <w:rFonts w:ascii="GHEA Grapalat" w:hAnsi="GHEA Grapalat"/>
+          <w:bCs/>
+          <w:lang w:val="hy-AM"/>
+        </w:rPr>
+        <w:t>Համայնք 0 (size=1): [1]</w:t>
+      </w:r>
     </w:p>
     <w:p>
       <w:pPr>
@@ -36433,17 +37945,17 @@
         <w:jc w:val="both"/>
         <w:rPr>
           <w:rFonts w:ascii="GHEA Grapalat" w:hAnsi="GHEA Grapalat"/>
-          <w:b/>
-          <w:lang w:val="hy-AM"/>
-        </w:rPr>
-      </w:pPr>
-      <w:r>
-        <w:rPr>
-          <w:rFonts w:ascii="GHEA Grapalat" w:hAnsi="GHEA Grapalat"/>
-          <w:b/>
-          <w:lang w:val="hy-AM"/>
-        </w:rPr>
-        <w:t>Ուղղորդված քաշով</w:t>
+          <w:bCs/>
+          <w:lang w:val="hy-AM"/>
+        </w:rPr>
+      </w:pPr>
+      <w:r>
+        <w:rPr>
+          <w:rFonts w:ascii="GHEA Grapalat" w:hAnsi="GHEA Grapalat"/>
+          <w:bCs/>
+          <w:lang w:val="hy-AM"/>
+        </w:rPr>
+        <w:t>Համայնք 1 (size=6): [15, 2, 49, 31, 95, 86]</w:t>
       </w:r>
     </w:p>
     <w:p>
@@ -36453,10 +37965,18 @@
         <w:jc w:val="both"/>
         <w:rPr>
           <w:rFonts w:ascii="GHEA Grapalat" w:hAnsi="GHEA Grapalat"/>
-          <w:b/>
-          <w:lang w:val="hy-AM"/>
-        </w:rPr>
-      </w:pPr>
+          <w:bCs/>
+          <w:lang w:val="hy-AM"/>
+        </w:rPr>
+      </w:pPr>
+      <w:r>
+        <w:rPr>
+          <w:rFonts w:ascii="GHEA Grapalat" w:hAnsi="GHEA Grapalat"/>
+          <w:bCs/>
+          <w:lang w:val="hy-AM"/>
+        </w:rPr>
+        <w:t>Համայնք 22 (size=8): [3, 55, 7, 79, 26, 100, 35, 39]</w:t>
+      </w:r>
     </w:p>
     <w:p>
       <w:pPr>
@@ -36475,7 +37995,7 @@
           <w:bCs/>
           <w:lang w:val="hy-AM"/>
         </w:rPr>
-        <w:t>Համայնք 0 (size=1): [1]</w:t>
+        <w:t>Համայնք 4 (size=7): [4, 23, 72, 47, 27, 99, 84]</w:t>
       </w:r>
     </w:p>
     <w:p>
@@ -36495,7 +38015,7 @@
           <w:bCs/>
           <w:lang w:val="hy-AM"/>
         </w:rPr>
-        <w:t>Համայնք 1 (size=6): [15, 2, 49, 31, 95, 86]</w:t>
+        <w:t>Համայնք 7 (size=12): [5, 13, 6, 78, 8, 66, 12, 19, 90, 42, 85, 88]</w:t>
       </w:r>
     </w:p>
     <w:p>
@@ -36515,7 +38035,7 @@
           <w:bCs/>
           <w:lang w:val="hy-AM"/>
         </w:rPr>
-        <w:t>Համայնք 22 (size=8): [3, 55, 7, 79, 26, 100, 35, 39]</w:t>
+        <w:t>Համայնք 11 (size=9): [9, 92, 11, 16, 17, 43, 70, 74, 80]</w:t>
       </w:r>
     </w:p>
     <w:p>
@@ -36535,7 +38055,7 @@
           <w:bCs/>
           <w:lang w:val="hy-AM"/>
         </w:rPr>
-        <w:t>Համայնք 4 (size=7): [4, 23, 72, 47, 27, 99, 84]</w:t>
+        <w:t>Համայնք 9 (size=6): [10, 30, 32, 69, 33, 96]</w:t>
       </w:r>
     </w:p>
     <w:p>
@@ -36555,7 +38075,8 @@
           <w:bCs/>
           <w:lang w:val="hy-AM"/>
         </w:rPr>
-        <w:t>Համայնք 7 (size=12): [5, 13, 6, 78, 8, 66, 12, 19, 90, 42, 85, 88]</w:t>
+        <w:lastRenderedPageBreak/>
+        <w:t>Համայնք 30 (size=4): [14, 38, 45, 87]</w:t>
       </w:r>
     </w:p>
     <w:p>
@@ -36575,7 +38096,7 @@
           <w:bCs/>
           <w:lang w:val="hy-AM"/>
         </w:rPr>
-        <w:t>Համայնք 11 (size=9): [9, 92, 11, 16, 17, 43, 70, 74, 80]</w:t>
+        <w:t>Համայնք 16 (size=6): [63, 20, 89, 25, 56, 76]</w:t>
       </w:r>
     </w:p>
     <w:p>
@@ -36595,7 +38116,7 @@
           <w:bCs/>
           <w:lang w:val="hy-AM"/>
         </w:rPr>
-        <w:t>Համայնք 9 (size=6): [10, 30, 32, 69, 33, 96]</w:t>
+        <w:t>Համայնք 13 (size=1): [18]</w:t>
       </w:r>
     </w:p>
     <w:p>
@@ -36615,8 +38136,7 @@
           <w:bCs/>
           <w:lang w:val="hy-AM"/>
         </w:rPr>
-        <w:lastRenderedPageBreak/>
-        <w:t>Համայնք 30 (size=4): [14, 38, 45, 87]</w:t>
+        <w:t>Համայնք 17 (size=5): [46, 21, 51, 59, 82]</w:t>
       </w:r>
     </w:p>
     <w:p>
@@ -36636,7 +38156,7 @@
           <w:bCs/>
           <w:lang w:val="hy-AM"/>
         </w:rPr>
-        <w:t>Համայնք 16 (size=6): [63, 20, 89, 25, 56, 76]</w:t>
+        <w:t>Համայնք 18 (size=2): [81, 40]</w:t>
       </w:r>
     </w:p>
     <w:p>
@@ -36656,7 +38176,7 @@
           <w:bCs/>
           <w:lang w:val="hy-AM"/>
         </w:rPr>
-        <w:t>Համայնք 13 (size=1): [18]</w:t>
+        <w:t>Համայնք 19 (size=1): [22]</w:t>
       </w:r>
     </w:p>
     <w:p>
@@ -36676,7 +38196,7 @@
           <w:bCs/>
           <w:lang w:val="hy-AM"/>
         </w:rPr>
-        <w:t>Համայնք 17 (size=5): [46, 21, 51, 59, 82]</w:t>
+        <w:t>Համայնք 20 (size=4): [24, 37, 97, 65]</w:t>
       </w:r>
     </w:p>
     <w:p>
@@ -36696,7 +38216,7 @@
           <w:bCs/>
           <w:lang w:val="hy-AM"/>
         </w:rPr>
-        <w:t>Համայնք 18 (size=2): [81, 40]</w:t>
+        <w:t>Համայնք 23 (size=1): [28]</w:t>
       </w:r>
     </w:p>
     <w:p>
@@ -36716,7 +38236,7 @@
           <w:bCs/>
           <w:lang w:val="hy-AM"/>
         </w:rPr>
-        <w:t>Համայնք 19 (size=1): [22]</w:t>
+        <w:t>Համայնք 24 (size=1): [29]</w:t>
       </w:r>
     </w:p>
     <w:p>
@@ -36736,7 +38256,7 @@
           <w:bCs/>
           <w:lang w:val="hy-AM"/>
         </w:rPr>
-        <w:t>Համայնք 20 (size=4): [24, 37, 97, 65]</w:t>
+        <w:t>Համայնք 25 (size=1): [93]</w:t>
       </w:r>
     </w:p>
     <w:p>
@@ -36756,7 +38276,7 @@
           <w:bCs/>
           <w:lang w:val="hy-AM"/>
         </w:rPr>
-        <w:t>Համայնք 23 (size=1): [28]</w:t>
+        <w:t>Համայնք 27 (size=7): [34, 41, 61, 57, 94, 75, 83]</w:t>
       </w:r>
     </w:p>
     <w:p>
@@ -36776,7 +38296,7 @@
           <w:bCs/>
           <w:lang w:val="hy-AM"/>
         </w:rPr>
-        <w:t>Համայնք 24 (size=1): [29]</w:t>
+        <w:t>Համայնք 29 (size=1): [36]</w:t>
       </w:r>
     </w:p>
     <w:p>
@@ -36796,7 +38316,7 @@
           <w:bCs/>
           <w:lang w:val="hy-AM"/>
         </w:rPr>
-        <w:t>Համայնք 25 (size=1): [93]</w:t>
+        <w:t>Համայնք 32 (size=1): [44]</w:t>
       </w:r>
     </w:p>
     <w:p>
@@ -36816,7 +38336,7 @@
           <w:bCs/>
           <w:lang w:val="hy-AM"/>
         </w:rPr>
-        <w:t>Համայնք 27 (size=7): [34, 41, 61, 57, 94, 75, 83]</w:t>
+        <w:t>Համայնք 2 (size=1): [48]</w:t>
       </w:r>
     </w:p>
     <w:p>
@@ -36836,7 +38356,7 @@
           <w:bCs/>
           <w:lang w:val="hy-AM"/>
         </w:rPr>
-        <w:t>Համայնք 29 (size=1): [36]</w:t>
+        <w:t>Համայնք 3 (size=2): [50, 54]</w:t>
       </w:r>
     </w:p>
     <w:p>
@@ -36856,7 +38376,7 @@
           <w:bCs/>
           <w:lang w:val="hy-AM"/>
         </w:rPr>
-        <w:t>Համայնք 32 (size=1): [44]</w:t>
+        <w:t>Համայնք 5 (size=1): [52]</w:t>
       </w:r>
     </w:p>
     <w:p>
@@ -36876,7 +38396,7 @@
           <w:bCs/>
           <w:lang w:val="hy-AM"/>
         </w:rPr>
-        <w:t>Համայնք 2 (size=1): [48]</w:t>
+        <w:t>Համայնք 6 (size=1): [53]</w:t>
       </w:r>
     </w:p>
     <w:p>
@@ -36896,7 +38416,7 @@
           <w:bCs/>
           <w:lang w:val="hy-AM"/>
         </w:rPr>
-        <w:t>Համայնք 3 (size=2): [50, 54]</w:t>
+        <w:t>Համայնք 8 (size=2): [58, 98]</w:t>
       </w:r>
     </w:p>
     <w:p>
@@ -36916,7 +38436,7 @@
           <w:bCs/>
           <w:lang w:val="hy-AM"/>
         </w:rPr>
-        <w:t>Համայնք 5 (size=1): [52]</w:t>
+        <w:t>Համայնք 10 (size=1): [60]</w:t>
       </w:r>
     </w:p>
     <w:p>
@@ -36936,7 +38456,7 @@
           <w:bCs/>
           <w:lang w:val="hy-AM"/>
         </w:rPr>
-        <w:t>Համայնք 6 (size=1): [53]</w:t>
+        <w:t>Համայնք 12 (size=2): [62, 71]</w:t>
       </w:r>
     </w:p>
     <w:p>
@@ -36956,7 +38476,7 @@
           <w:bCs/>
           <w:lang w:val="hy-AM"/>
         </w:rPr>
-        <w:t>Համայնք 8 (size=2): [58, 98]</w:t>
+        <w:t>Համայնք 14 (size=1): [77]</w:t>
       </w:r>
     </w:p>
     <w:p>
@@ -36976,7 +38496,7 @@
           <w:bCs/>
           <w:lang w:val="hy-AM"/>
         </w:rPr>
-        <w:t>Համայնք 10 (size=1): [60]</w:t>
+        <w:t>Համայնք 15 (size=1): [64]</w:t>
       </w:r>
     </w:p>
     <w:p>
@@ -36996,7 +38516,8 @@
           <w:bCs/>
           <w:lang w:val="hy-AM"/>
         </w:rPr>
-        <w:t>Համայնք 12 (size=2): [62, 71]</w:t>
+        <w:lastRenderedPageBreak/>
+        <w:t>Համայնք 21 (size=1): [67]</w:t>
       </w:r>
     </w:p>
     <w:p>
@@ -37016,7 +38537,7 @@
           <w:bCs/>
           <w:lang w:val="hy-AM"/>
         </w:rPr>
-        <w:t>Համայնք 14 (size=1): [77]</w:t>
+        <w:t>Համայնք 26 (size=1): [68]</w:t>
       </w:r>
     </w:p>
     <w:p>
@@ -37036,7 +38557,7 @@
           <w:bCs/>
           <w:lang w:val="hy-AM"/>
         </w:rPr>
-        <w:t>Համայնք 15 (size=1): [64]</w:t>
+        <w:t>Համայնք 28 (size=1): [73]</w:t>
       </w:r>
     </w:p>
     <w:p>
@@ -37056,8 +38577,7 @@
           <w:bCs/>
           <w:lang w:val="hy-AM"/>
         </w:rPr>
-        <w:lastRenderedPageBreak/>
-        <w:t>Համայնք 21 (size=1): [67]</w:t>
+        <w:t>Համայնք 31 (size=1): [91]</w:t>
       </w:r>
     </w:p>
     <w:p>
@@ -37067,18 +38587,10 @@
         <w:jc w:val="both"/>
         <w:rPr>
           <w:rFonts w:ascii="GHEA Grapalat" w:hAnsi="GHEA Grapalat"/>
-          <w:bCs/>
-          <w:lang w:val="hy-AM"/>
-        </w:rPr>
-      </w:pPr>
-      <w:r>
-        <w:rPr>
-          <w:rFonts w:ascii="GHEA Grapalat" w:hAnsi="GHEA Grapalat"/>
-          <w:bCs/>
-          <w:lang w:val="hy-AM"/>
-        </w:rPr>
-        <w:t>Համայնք 26 (size=1): [68]</w:t>
-      </w:r>
+          <w:b/>
+          <w:lang w:val="hy-AM"/>
+        </w:rPr>
+      </w:pPr>
     </w:p>
     <w:p>
       <w:pPr>
@@ -37087,17 +38599,17 @@
         <w:jc w:val="both"/>
         <w:rPr>
           <w:rFonts w:ascii="GHEA Grapalat" w:hAnsi="GHEA Grapalat"/>
-          <w:bCs/>
-          <w:lang w:val="hy-AM"/>
-        </w:rPr>
-      </w:pPr>
-      <w:r>
-        <w:rPr>
-          <w:rFonts w:ascii="GHEA Grapalat" w:hAnsi="GHEA Grapalat"/>
-          <w:bCs/>
-          <w:lang w:val="hy-AM"/>
-        </w:rPr>
-        <w:t>Համայնք 28 (size=1): [73]</w:t>
+          <w:b/>
+          <w:lang w:val="hy-AM"/>
+        </w:rPr>
+      </w:pPr>
+      <w:r>
+        <w:rPr>
+          <w:rFonts w:ascii="GHEA Grapalat" w:hAnsi="GHEA Grapalat"/>
+          <w:b/>
+          <w:lang w:val="hy-AM"/>
+        </w:rPr>
+        <w:t>Ոչ ուղղորդված</w:t>
       </w:r>
     </w:p>
     <w:p>
@@ -37117,7 +38629,7 @@
           <w:bCs/>
           <w:lang w:val="hy-AM"/>
         </w:rPr>
-        <w:t>Համայնք 31 (size=1): [91]</w:t>
+        <w:t>Համայնք 0 (size=10): [1, 15, 2, 31, 86, 95, 34, 41, 36, 75]</w:t>
       </w:r>
     </w:p>
     <w:p>
@@ -37127,10 +38639,18 @@
         <w:jc w:val="both"/>
         <w:rPr>
           <w:rFonts w:ascii="GHEA Grapalat" w:hAnsi="GHEA Grapalat"/>
-          <w:b/>
-          <w:lang w:val="hy-AM"/>
-        </w:rPr>
-      </w:pPr>
+          <w:bCs/>
+          <w:lang w:val="hy-AM"/>
+        </w:rPr>
+      </w:pPr>
+      <w:r>
+        <w:rPr>
+          <w:rFonts w:ascii="GHEA Grapalat" w:hAnsi="GHEA Grapalat"/>
+          <w:bCs/>
+          <w:lang w:val="hy-AM"/>
+        </w:rPr>
+        <w:t>Համայնք 1 (size=9): [3, 67, 79, 7, 63, 25, 58, 98, 77]</w:t>
+      </w:r>
     </w:p>
     <w:p>
       <w:pPr>
@@ -37139,17 +38659,17 @@
         <w:jc w:val="both"/>
         <w:rPr>
           <w:rFonts w:ascii="GHEA Grapalat" w:hAnsi="GHEA Grapalat"/>
-          <w:b/>
-          <w:lang w:val="hy-AM"/>
-        </w:rPr>
-      </w:pPr>
-      <w:r>
-        <w:rPr>
-          <w:rFonts w:ascii="GHEA Grapalat" w:hAnsi="GHEA Grapalat"/>
-          <w:b/>
-          <w:lang w:val="hy-AM"/>
-        </w:rPr>
-        <w:t>Ոչ ուղղորդված</w:t>
+          <w:bCs/>
+          <w:lang w:val="hy-AM"/>
+        </w:rPr>
+      </w:pPr>
+      <w:r>
+        <w:rPr>
+          <w:rFonts w:ascii="GHEA Grapalat" w:hAnsi="GHEA Grapalat"/>
+          <w:bCs/>
+          <w:lang w:val="hy-AM"/>
+        </w:rPr>
+        <w:t>Համայնք 2 (size=11): [55, 26, 100, 94, 35, 39, 68, 53, 61, 57, 83]</w:t>
       </w:r>
     </w:p>
     <w:p>
@@ -37163,6 +38683,14 @@
           <w:lang w:val="hy-AM"/>
         </w:rPr>
       </w:pPr>
+      <w:r>
+        <w:rPr>
+          <w:rFonts w:ascii="GHEA Grapalat" w:hAnsi="GHEA Grapalat"/>
+          <w:bCs/>
+          <w:lang w:val="hy-AM"/>
+        </w:rPr>
+        <w:t>Համայնք 4 (size=10): [4, 23, 14, 99, 45, 72, 27, 38, 87, 84]</w:t>
+      </w:r>
     </w:p>
     <w:p>
       <w:pPr>
@@ -37181,7 +38709,7 @@
           <w:bCs/>
           <w:lang w:val="hy-AM"/>
         </w:rPr>
-        <w:t>Համայնք 0 (size=10): [1, 15, 2, 31, 86, 95, 34, 41, 36, 75]</w:t>
+        <w:t>Համայնք 7 (size=12): [5, 13, 10, 90, 12, 96, 85, 19, 33, 42, 48, 91]</w:t>
       </w:r>
     </w:p>
     <w:p>
@@ -37201,7 +38729,7 @@
           <w:bCs/>
           <w:lang w:val="hy-AM"/>
         </w:rPr>
-        <w:t>Համայնք 1 (size=9): [3, 67, 79, 7, 63, 25, 58, 98, 77]</w:t>
+        <w:t>Համայնք 6 (size=7): [6, 78, 88, 8, 66, 64, 11]</w:t>
       </w:r>
     </w:p>
     <w:p>
@@ -37221,7 +38749,7 @@
           <w:bCs/>
           <w:lang w:val="hy-AM"/>
         </w:rPr>
-        <w:t>Համայնք 2 (size=11): [55, 26, 100, 94, 35, 39, 68, 53, 61, 57, 83]</w:t>
+        <w:t>Համայնք 9 (size=10): [9, 92, 16, 49, 74, 17, 43, 70, 80, 73]</w:t>
       </w:r>
     </w:p>
     <w:p>
@@ -37241,7 +38769,7 @@
           <w:bCs/>
           <w:lang w:val="hy-AM"/>
         </w:rPr>
-        <w:t>Համայնք 4 (size=10): [4, 23, 14, 99, 45, 72, 27, 38, 87, 84]</w:t>
+        <w:t>Համայնք 5 (size=6): [30, 29, 93, 69, 32, 44]</w:t>
       </w:r>
     </w:p>
     <w:p>
@@ -37261,7 +38789,7 @@
           <w:bCs/>
           <w:lang w:val="hy-AM"/>
         </w:rPr>
-        <w:t>Համայնք 7 (size=12): [5, 13, 10, 90, 12, 96, 85, 19, 33, 42, 48, 91]</w:t>
+        <w:t>Համայնք 3 (size=14): [18, 46, 21, 81, 51, 22, 40, 24, 47, 65, 37, 97, 59, 82]</w:t>
       </w:r>
     </w:p>
     <w:p>
@@ -37281,7 +38809,7 @@
           <w:bCs/>
           <w:lang w:val="hy-AM"/>
         </w:rPr>
-        <w:t>Համայնք 6 (size=7): [6, 78, 88, 8, 66, 64, 11]</w:t>
+        <w:t>Համայնք 8 (size=11): [20, 89, 56, 76, 28, 50, 54, 52, 60, 62, 71]</w:t>
       </w:r>
     </w:p>
     <w:p>
@@ -37291,18 +38819,10 @@
         <w:jc w:val="both"/>
         <w:rPr>
           <w:rFonts w:ascii="GHEA Grapalat" w:hAnsi="GHEA Grapalat"/>
-          <w:bCs/>
-          <w:lang w:val="hy-AM"/>
-        </w:rPr>
-      </w:pPr>
-      <w:r>
-        <w:rPr>
-          <w:rFonts w:ascii="GHEA Grapalat" w:hAnsi="GHEA Grapalat"/>
-          <w:bCs/>
-          <w:lang w:val="hy-AM"/>
-        </w:rPr>
-        <w:t>Համայնք 9 (size=10): [9, 92, 16, 49, 74, 17, 43, 70, 80, 73]</w:t>
-      </w:r>
+          <w:b/>
+          <w:lang w:val="hy-AM"/>
+        </w:rPr>
+      </w:pPr>
     </w:p>
     <w:p>
       <w:pPr>
@@ -37311,17 +38831,17 @@
         <w:jc w:val="both"/>
         <w:rPr>
           <w:rFonts w:ascii="GHEA Grapalat" w:hAnsi="GHEA Grapalat"/>
-          <w:bCs/>
-          <w:lang w:val="hy-AM"/>
-        </w:rPr>
-      </w:pPr>
-      <w:r>
-        <w:rPr>
-          <w:rFonts w:ascii="GHEA Grapalat" w:hAnsi="GHEA Grapalat"/>
-          <w:bCs/>
-          <w:lang w:val="hy-AM"/>
-        </w:rPr>
-        <w:t>Համայնք 5 (size=6): [30, 29, 93, 69, 32, 44]</w:t>
+          <w:b/>
+          <w:lang w:val="hy-AM"/>
+        </w:rPr>
+      </w:pPr>
+      <w:r>
+        <w:rPr>
+          <w:rFonts w:ascii="GHEA Grapalat" w:hAnsi="GHEA Grapalat"/>
+          <w:b/>
+          <w:lang w:val="hy-AM"/>
+        </w:rPr>
+        <w:t>Ոչ ուղղորդված քաշով</w:t>
       </w:r>
     </w:p>
     <w:p>
@@ -37341,7 +38861,7 @@
           <w:bCs/>
           <w:lang w:val="hy-AM"/>
         </w:rPr>
-        <w:t>Համայնք 3 (size=14): [18, 46, 21, 81, 51, 22, 40, 24, 47, 65, 37, 97, 59, 82]</w:t>
+        <w:t>Համայնք 0 (size=11): [1, 15, 2, 9, 92, 16, 49, 11, 31, 86, 95]</w:t>
       </w:r>
     </w:p>
     <w:p>
@@ -37361,7 +38881,7 @@
           <w:bCs/>
           <w:lang w:val="hy-AM"/>
         </w:rPr>
-        <w:t>Համայնք 8 (size=11): [20, 89, 56, 76, 28, 50, 54, 52, 60, 62, 71]</w:t>
+        <w:t>Համայնք 1 (size=4): [3, 67, 79, 7]</w:t>
       </w:r>
     </w:p>
     <w:p>
@@ -37371,10 +38891,18 @@
         <w:jc w:val="both"/>
         <w:rPr>
           <w:rFonts w:ascii="GHEA Grapalat" w:hAnsi="GHEA Grapalat"/>
-          <w:b/>
-          <w:lang w:val="hy-AM"/>
-        </w:rPr>
-      </w:pPr>
+          <w:bCs/>
+          <w:lang w:val="hy-AM"/>
+        </w:rPr>
+      </w:pPr>
+      <w:r>
+        <w:rPr>
+          <w:rFonts w:ascii="GHEA Grapalat" w:hAnsi="GHEA Grapalat"/>
+          <w:bCs/>
+          <w:lang w:val="hy-AM"/>
+        </w:rPr>
+        <w:t>Համայնք 2 (size=7): [55, 34, 94, 53, 61, 57, 83]</w:t>
+      </w:r>
     </w:p>
     <w:p>
       <w:pPr>
@@ -37383,17 +38911,17 @@
         <w:jc w:val="both"/>
         <w:rPr>
           <w:rFonts w:ascii="GHEA Grapalat" w:hAnsi="GHEA Grapalat"/>
-          <w:b/>
-          <w:lang w:val="hy-AM"/>
-        </w:rPr>
-      </w:pPr>
-      <w:r>
-        <w:rPr>
-          <w:rFonts w:ascii="GHEA Grapalat" w:hAnsi="GHEA Grapalat"/>
-          <w:b/>
-          <w:lang w:val="hy-AM"/>
-        </w:rPr>
-        <w:t>Ոչ ուղղորդված քաշով</w:t>
+          <w:bCs/>
+          <w:lang w:val="hy-AM"/>
+        </w:rPr>
+      </w:pPr>
+      <w:r>
+        <w:rPr>
+          <w:rFonts w:ascii="GHEA Grapalat" w:hAnsi="GHEA Grapalat"/>
+          <w:bCs/>
+          <w:lang w:val="hy-AM"/>
+        </w:rPr>
+        <w:t>Համայնք 3 (size=8): [4, 23, 14, 99, 72, 47, 27, 84]</w:t>
       </w:r>
     </w:p>
     <w:p>
@@ -37403,10 +38931,19 @@
         <w:jc w:val="both"/>
         <w:rPr>
           <w:rFonts w:ascii="GHEA Grapalat" w:hAnsi="GHEA Grapalat"/>
-          <w:b/>
-          <w:lang w:val="hy-AM"/>
-        </w:rPr>
-      </w:pPr>
+          <w:bCs/>
+          <w:lang w:val="hy-AM"/>
+        </w:rPr>
+      </w:pPr>
+      <w:r>
+        <w:rPr>
+          <w:rFonts w:ascii="GHEA Grapalat" w:hAnsi="GHEA Grapalat"/>
+          <w:bCs/>
+          <w:lang w:val="hy-AM"/>
+        </w:rPr>
+        <w:lastRenderedPageBreak/>
+        <w:t>Համայնք 6 (size=5): [5, 10, 30, 96, 33]</w:t>
+      </w:r>
     </w:p>
     <w:p>
       <w:pPr>
@@ -37425,7 +38962,7 @@
           <w:bCs/>
           <w:lang w:val="hy-AM"/>
         </w:rPr>
-        <w:t>Համայնք 0 (size=11): [1, 15, 2, 9, 92, 16, 49, 11, 31, 86, 95]</w:t>
+        <w:t>Համայնք 14 (size=4): [13, 12, 85, 91]</w:t>
       </w:r>
     </w:p>
     <w:p>
@@ -37445,7 +38982,7 @@
           <w:bCs/>
           <w:lang w:val="hy-AM"/>
         </w:rPr>
-        <w:t>Համայնք 1 (size=4): [3, 67, 79, 7]</w:t>
+        <w:t>Համայնք 8 (size=2): [90, 19]</w:t>
       </w:r>
     </w:p>
     <w:p>
@@ -37465,8 +39002,7 @@
           <w:bCs/>
           <w:lang w:val="hy-AM"/>
         </w:rPr>
-        <w:lastRenderedPageBreak/>
-        <w:t>Համայնք 2 (size=7): [55, 34, 94, 53, 61, 57, 83]</w:t>
+        <w:t>Համայնք 9 (size=3): [6, 78, 88]</w:t>
       </w:r>
     </w:p>
     <w:p>
@@ -37486,7 +39022,7 @@
           <w:bCs/>
           <w:lang w:val="hy-AM"/>
         </w:rPr>
-        <w:t>Համայնք 3 (size=8): [4, 23, 14, 99, 72, 47, 27, 84]</w:t>
+        <w:t>Համայնք 10 (size=3): [8, 66, 64]</w:t>
       </w:r>
     </w:p>
     <w:p>
@@ -37506,7 +39042,7 @@
           <w:bCs/>
           <w:lang w:val="hy-AM"/>
         </w:rPr>
-        <w:t>Համայնք 6 (size=5): [5, 10, 30, 96, 33]</w:t>
+        <w:t>Համայնք 12 (size=4): [74, 70, 80, 73]</w:t>
       </w:r>
     </w:p>
     <w:p>
@@ -37526,7 +39062,7 @@
           <w:bCs/>
           <w:lang w:val="hy-AM"/>
         </w:rPr>
-        <w:t>Համայնք 14 (size=4): [13, 12, 85, 91]</w:t>
+        <w:t>Համայնք 15 (size=3): [45, 38, 87]</w:t>
       </w:r>
     </w:p>
     <w:p>
@@ -37546,7 +39082,7 @@
           <w:bCs/>
           <w:lang w:val="hy-AM"/>
         </w:rPr>
-        <w:t>Համայնք 8 (size=2): [90, 19]</w:t>
+        <w:t>Համայնք 17 (size=6): [17, 63, 43, 25, 58, 77]</w:t>
       </w:r>
     </w:p>
     <w:p>
@@ -37566,7 +39102,7 @@
           <w:bCs/>
           <w:lang w:val="hy-AM"/>
         </w:rPr>
-        <w:t>Համայնք 9 (size=3): [6, 78, 88]</w:t>
+        <w:t>Համայնք 18 (size=6): [18, 46, 21, 51, 59, 82]</w:t>
       </w:r>
     </w:p>
     <w:p>
@@ -37586,7 +39122,7 @@
           <w:bCs/>
           <w:lang w:val="hy-AM"/>
         </w:rPr>
-        <w:t>Համայնք 10 (size=3): [8, 66, 64]</w:t>
+        <w:t>Համայնք 16 (size=9): [20, 89, 56, 76, 28, 50, 54, 52, 71]</w:t>
       </w:r>
     </w:p>
     <w:p>
@@ -37606,7 +39142,7 @@
           <w:bCs/>
           <w:lang w:val="hy-AM"/>
         </w:rPr>
-        <w:t>Համայնք 12 (size=4): [74, 70, 80, 73]</w:t>
+        <w:t>Համայնք 4 (size=7): [81, 22, 40, 24, 65, 37, 97]</w:t>
       </w:r>
     </w:p>
     <w:p>
@@ -37626,7 +39162,7 @@
           <w:bCs/>
           <w:lang w:val="hy-AM"/>
         </w:rPr>
-        <w:t>Համայնք 15 (size=3): [45, 38, 87]</w:t>
+        <w:t>Համայնք 5 (size=5): [26, 100, 35, 39, 68]</w:t>
       </w:r>
     </w:p>
     <w:p>
@@ -37646,7 +39182,7 @@
           <w:bCs/>
           <w:lang w:val="hy-AM"/>
         </w:rPr>
-        <w:t>Համայնք 17 (size=6): [17, 63, 43, 25, 58, 77]</w:t>
+        <w:t>Համայնք 7 (size=5): [29, 93, 69, 32, 44]</w:t>
       </w:r>
     </w:p>
     <w:p>
@@ -37666,7 +39202,7 @@
           <w:bCs/>
           <w:lang w:val="hy-AM"/>
         </w:rPr>
-        <w:t>Համայնք 18 (size=6): [18, 46, 21, 51, 59, 82]</w:t>
+        <w:t>Համայնք 11 (size=3): [41, 36, 75]</w:t>
       </w:r>
     </w:p>
     <w:p>
@@ -37686,7 +39222,7 @@
           <w:bCs/>
           <w:lang w:val="hy-AM"/>
         </w:rPr>
-        <w:t>Համայնք 16 (size=9): [20, 89, 56, 76, 28, 50, 54, 52, 71]</w:t>
+        <w:t>Համայնք 13 (size=2): [42, 48]</w:t>
       </w:r>
     </w:p>
     <w:p>
@@ -37706,7 +39242,7 @@
           <w:bCs/>
           <w:lang w:val="hy-AM"/>
         </w:rPr>
-        <w:t>Համայնք 4 (size=7): [81, 22, 40, 24, 65, 37, 97]</w:t>
+        <w:t>Համայնք 19 (size=1): [98]</w:t>
       </w:r>
     </w:p>
     <w:p>
@@ -37726,7 +39262,25 @@
           <w:bCs/>
           <w:lang w:val="hy-AM"/>
         </w:rPr>
-        <w:t>Համայնք 5 (size=5): [26, 100, 35, 39, 68]</w:t>
+        <w:t xml:space="preserve">Համայնք 20 (size=2): [60, 62] </w:t>
+      </w:r>
+    </w:p>
+    <w:p>
+      <w:pPr>
+        <w:spacing w:after="0" w:line="360" w:lineRule="auto"/>
+        <w:ind w:firstLine="340"/>
+        <w:jc w:val="both"/>
+        <w:rPr>
+          <w:rFonts w:ascii="GHEA Grapalat" w:hAnsi="GHEA Grapalat"/>
+          <w:lang w:val="hy-AM"/>
+        </w:rPr>
+      </w:pPr>
+      <w:r>
+        <w:rPr>
+          <w:rFonts w:ascii="GHEA Grapalat" w:hAnsi="GHEA Grapalat" w:cs="Sylfaen"/>
+          <w:lang w:val="hy-AM"/>
+        </w:rPr>
+        <w:tab/>
       </w:r>
     </w:p>
     <w:p>
@@ -37736,123 +39290,7 @@
         <w:jc w:val="both"/>
         <w:rPr>
           <w:rFonts w:ascii="GHEA Grapalat" w:hAnsi="GHEA Grapalat"/>
-          <w:bCs/>
-          <w:lang w:val="hy-AM"/>
-        </w:rPr>
-      </w:pPr>
-      <w:r>
-        <w:rPr>
-          <w:rFonts w:ascii="GHEA Grapalat" w:hAnsi="GHEA Grapalat"/>
-          <w:bCs/>
-          <w:lang w:val="hy-AM"/>
-        </w:rPr>
-        <w:t>Համայնք 7 (size=5): [29, 93, 69, 32, 44]</w:t>
-      </w:r>
-    </w:p>
-    <w:p>
-      <w:pPr>
-        <w:spacing w:line="360" w:lineRule="auto"/>
-        <w:ind w:firstLine="340"/>
-        <w:jc w:val="both"/>
-        <w:rPr>
-          <w:rFonts w:ascii="GHEA Grapalat" w:hAnsi="GHEA Grapalat"/>
-          <w:bCs/>
-          <w:lang w:val="hy-AM"/>
-        </w:rPr>
-      </w:pPr>
-      <w:r>
-        <w:rPr>
-          <w:rFonts w:ascii="GHEA Grapalat" w:hAnsi="GHEA Grapalat"/>
-          <w:bCs/>
-          <w:lang w:val="hy-AM"/>
-        </w:rPr>
-        <w:t>Համայնք 11 (size=3): [41, 36, 75]</w:t>
-      </w:r>
-    </w:p>
-    <w:p>
-      <w:pPr>
-        <w:spacing w:line="360" w:lineRule="auto"/>
-        <w:ind w:firstLine="340"/>
-        <w:jc w:val="both"/>
-        <w:rPr>
-          <w:rFonts w:ascii="GHEA Grapalat" w:hAnsi="GHEA Grapalat"/>
-          <w:bCs/>
-          <w:lang w:val="hy-AM"/>
-        </w:rPr>
-      </w:pPr>
-      <w:r>
-        <w:rPr>
-          <w:rFonts w:ascii="GHEA Grapalat" w:hAnsi="GHEA Grapalat"/>
-          <w:bCs/>
-          <w:lang w:val="hy-AM"/>
-        </w:rPr>
-        <w:t>Համայնք 13 (size=2): [42, 48]</w:t>
-      </w:r>
-    </w:p>
-    <w:p>
-      <w:pPr>
-        <w:spacing w:line="360" w:lineRule="auto"/>
-        <w:ind w:firstLine="340"/>
-        <w:jc w:val="both"/>
-        <w:rPr>
-          <w:rFonts w:ascii="GHEA Grapalat" w:hAnsi="GHEA Grapalat"/>
-          <w:bCs/>
-          <w:lang w:val="hy-AM"/>
-        </w:rPr>
-      </w:pPr>
-      <w:r>
-        <w:rPr>
-          <w:rFonts w:ascii="GHEA Grapalat" w:hAnsi="GHEA Grapalat"/>
-          <w:bCs/>
-          <w:lang w:val="hy-AM"/>
-        </w:rPr>
-        <w:t>Համայնք 19 (size=1): [98]</w:t>
-      </w:r>
-    </w:p>
-    <w:p>
-      <w:pPr>
-        <w:spacing w:line="360" w:lineRule="auto"/>
-        <w:ind w:firstLine="340"/>
-        <w:jc w:val="both"/>
-        <w:rPr>
-          <w:rFonts w:ascii="GHEA Grapalat" w:hAnsi="GHEA Grapalat"/>
-          <w:bCs/>
-        </w:rPr>
-      </w:pPr>
-      <w:r>
-        <w:rPr>
-          <w:rFonts w:ascii="GHEA Grapalat" w:hAnsi="GHEA Grapalat"/>
-          <w:bCs/>
-          <w:lang w:val="hy-AM"/>
-        </w:rPr>
-        <w:t xml:space="preserve">Համայնք 20 (size=2): [60, 62] </w:t>
-      </w:r>
-    </w:p>
-    <w:p>
-      <w:pPr>
-        <w:spacing w:after="0" w:line="360" w:lineRule="auto"/>
-        <w:ind w:firstLine="340"/>
-        <w:jc w:val="both"/>
-        <w:rPr>
-          <w:rFonts w:ascii="GHEA Grapalat" w:hAnsi="GHEA Grapalat"/>
-          <w:lang w:val="hy-AM"/>
-        </w:rPr>
-      </w:pPr>
-      <w:r>
-        <w:rPr>
-          <w:rFonts w:ascii="GHEA Grapalat" w:hAnsi="GHEA Grapalat" w:cs="Sylfaen"/>
-          <w:lang w:val="hy-AM"/>
-        </w:rPr>
-        <w:tab/>
-      </w:r>
-    </w:p>
-    <w:p>
-      <w:pPr>
-        <w:spacing w:line="360" w:lineRule="auto"/>
-        <w:ind w:firstLine="340"/>
-        <w:jc w:val="both"/>
-        <w:rPr>
-          <w:rFonts w:ascii="GHEA Grapalat" w:hAnsi="GHEA Grapalat"/>
+          <w:lang w:val="hy-AM"/>
         </w:rPr>
       </w:pPr>
     </w:p>
@@ -37865,6 +39303,7 @@
         <w:jc w:val="both"/>
         <w:rPr>
           <w:rFonts w:ascii="GHEA Grapalat" w:hAnsi="GHEA Grapalat"/>
+          <w:lang w:val="hy-AM"/>
         </w:rPr>
       </w:pPr>
     </w:p>
@@ -37996,7 +39435,6 @@
       <w:lvlJc w:val="left"/>
       <w:pPr>
         <w:ind w:left="902" w:hanging="285"/>
-        <w:jc w:val="left"/>
       </w:pPr>
       <w:rPr>
         <w:rFonts w:ascii="Sylfaen" w:eastAsia="Sylfaen" w:hAnsi="Sylfaen" w:cs="Sylfaen" w:hint="default"/>
@@ -39026,7 +40464,6 @@
       <w:lvlJc w:val="left"/>
       <w:pPr>
         <w:ind w:left="617" w:hanging="247"/>
-        <w:jc w:val="left"/>
       </w:pPr>
       <w:rPr>
         <w:rFonts w:ascii="Cambria Math" w:eastAsia="Cambria Math" w:hAnsi="Cambria Math" w:cs="Cambria Math" w:hint="default"/>
@@ -39048,7 +40485,6 @@
       <w:lvlJc w:val="left"/>
       <w:pPr>
         <w:ind w:left="1762" w:hanging="360"/>
-        <w:jc w:val="left"/>
       </w:pPr>
       <w:rPr>
         <w:rFonts w:ascii="Sylfaen" w:eastAsia="Sylfaen" w:hAnsi="Sylfaen" w:cs="Sylfaen" w:hint="default"/>
@@ -40687,9 +42123,9 @@
   </w:abstractNum>
   <w:abstractNum w:abstractNumId="22" w15:restartNumberingAfterBreak="0">
     <w:nsid w:val="737D5CF2"/>
-    <w:multiLevelType w:val="hybridMultilevel"/>
-    <w:tmpl w:val="D59445C2"/>
-    <w:lvl w:ilvl="0" w:tplc="3226645A">
+    <w:multiLevelType w:val="multilevel"/>
+    <w:tmpl w:val="E64697AE"/>
+    <w:lvl w:ilvl="0">
       <w:start w:val="1"/>
       <w:numFmt w:val="decimal"/>
       <w:lvlText w:val="%1."/>
@@ -40701,77 +42137,109 @@
         <w:rFonts w:ascii="Cambria Math" w:eastAsia="Cambria Math" w:hAnsi="Cambria Math" w:cs="Cambria Math" w:hint="default"/>
       </w:rPr>
     </w:lvl>
-    <w:lvl w:ilvl="1" w:tplc="04090019" w:tentative="1">
-      <w:start w:val="1"/>
-      <w:numFmt w:val="lowerLetter"/>
-      <w:lvlText w:val="%2."/>
+    <w:lvl w:ilvl="1">
+      <w:start w:val="2"/>
+      <w:numFmt w:val="decimal"/>
+      <w:isLgl/>
+      <w:lvlText w:val="%1.%2"/>
       <w:lvlJc w:val="left"/>
       <w:pPr>
-        <w:ind w:left="1780" w:hanging="360"/>
-      </w:pPr>
+        <w:ind w:left="1552" w:hanging="492"/>
+      </w:pPr>
+      <w:rPr>
+        <w:rFonts w:hint="default"/>
+      </w:rPr>
     </w:lvl>
-    <w:lvl w:ilvl="2" w:tplc="0409001B" w:tentative="1">
-      <w:start w:val="1"/>
-      <w:numFmt w:val="lowerRoman"/>
-      <w:lvlText w:val="%3."/>
-      <w:lvlJc w:val="right"/>
-      <w:pPr>
-        <w:ind w:left="2500" w:hanging="180"/>
-      </w:pPr>
-    </w:lvl>
-    <w:lvl w:ilvl="3" w:tplc="0409000F" w:tentative="1">
+    <w:lvl w:ilvl="2">
       <w:start w:val="1"/>
       <w:numFmt w:val="decimal"/>
-      <w:lvlText w:val="%4."/>
+      <w:isLgl/>
+      <w:lvlText w:val="%1.%2.%3"/>
       <w:lvlJc w:val="left"/>
       <w:pPr>
-        <w:ind w:left="3220" w:hanging="360"/>
-      </w:pPr>
+        <w:ind w:left="1780" w:hanging="720"/>
+      </w:pPr>
+      <w:rPr>
+        <w:rFonts w:hint="default"/>
+      </w:rPr>
     </w:lvl>
-    <w:lvl w:ilvl="4" w:tplc="04090019" w:tentative="1">
-      <w:start w:val="1"/>
-      <w:numFmt w:val="lowerLetter"/>
-      <w:lvlText w:val="%5."/>
-      <w:lvlJc w:val="left"/>
-      <w:pPr>
-        <w:ind w:left="3940" w:hanging="360"/>
-      </w:pPr>
-    </w:lvl>
-    <w:lvl w:ilvl="5" w:tplc="0409001B" w:tentative="1">
-      <w:start w:val="1"/>
-      <w:numFmt w:val="lowerRoman"/>
-      <w:lvlText w:val="%6."/>
-      <w:lvlJc w:val="right"/>
-      <w:pPr>
-        <w:ind w:left="4660" w:hanging="180"/>
-      </w:pPr>
-    </w:lvl>
-    <w:lvl w:ilvl="6" w:tplc="0409000F" w:tentative="1">
+    <w:lvl w:ilvl="3">
       <w:start w:val="1"/>
       <w:numFmt w:val="decimal"/>
-      <w:lvlText w:val="%7."/>
+      <w:isLgl/>
+      <w:lvlText w:val="%1.%2.%3.%4"/>
       <w:lvlJc w:val="left"/>
       <w:pPr>
-        <w:ind w:left="5380" w:hanging="360"/>
-      </w:pPr>
+        <w:ind w:left="2140" w:hanging="1080"/>
+      </w:pPr>
+      <w:rPr>
+        <w:rFonts w:hint="default"/>
+      </w:rPr>
     </w:lvl>
-    <w:lvl w:ilvl="7" w:tplc="04090019" w:tentative="1">
+    <w:lvl w:ilvl="4">
       <w:start w:val="1"/>
-      <w:numFmt w:val="lowerLetter"/>
-      <w:lvlText w:val="%8."/>
+      <w:numFmt w:val="decimal"/>
+      <w:isLgl/>
+      <w:lvlText w:val="%1.%2.%3.%4.%5"/>
       <w:lvlJc w:val="left"/>
       <w:pPr>
-        <w:ind w:left="6100" w:hanging="360"/>
-      </w:pPr>
+        <w:ind w:left="2140" w:hanging="1080"/>
+      </w:pPr>
+      <w:rPr>
+        <w:rFonts w:hint="default"/>
+      </w:rPr>
     </w:lvl>
-    <w:lvl w:ilvl="8" w:tplc="0409001B" w:tentative="1">
+    <w:lvl w:ilvl="5">
       <w:start w:val="1"/>
-      <w:numFmt w:val="lowerRoman"/>
-      <w:lvlText w:val="%9."/>
-      <w:lvlJc w:val="right"/>
-      <w:pPr>
-        <w:ind w:left="6820" w:hanging="180"/>
-      </w:pPr>
+      <w:numFmt w:val="decimal"/>
+      <w:isLgl/>
+      <w:lvlText w:val="%1.%2.%3.%4.%5.%6"/>
+      <w:lvlJc w:val="left"/>
+      <w:pPr>
+        <w:ind w:left="2500" w:hanging="1440"/>
+      </w:pPr>
+      <w:rPr>
+        <w:rFonts w:hint="default"/>
+      </w:rPr>
+    </w:lvl>
+    <w:lvl w:ilvl="6">
+      <w:start w:val="1"/>
+      <w:numFmt w:val="decimal"/>
+      <w:isLgl/>
+      <w:lvlText w:val="%1.%2.%3.%4.%5.%6.%7"/>
+      <w:lvlJc w:val="left"/>
+      <w:pPr>
+        <w:ind w:left="2500" w:hanging="1440"/>
+      </w:pPr>
+      <w:rPr>
+        <w:rFonts w:hint="default"/>
+      </w:rPr>
+    </w:lvl>
+    <w:lvl w:ilvl="7">
+      <w:start w:val="1"/>
+      <w:numFmt w:val="decimal"/>
+      <w:isLgl/>
+      <w:lvlText w:val="%1.%2.%3.%4.%5.%6.%7.%8"/>
+      <w:lvlJc w:val="left"/>
+      <w:pPr>
+        <w:ind w:left="2860" w:hanging="1800"/>
+      </w:pPr>
+      <w:rPr>
+        <w:rFonts w:hint="default"/>
+      </w:rPr>
+    </w:lvl>
+    <w:lvl w:ilvl="8">
+      <w:start w:val="1"/>
+      <w:numFmt w:val="decimal"/>
+      <w:isLgl/>
+      <w:lvlText w:val="%1.%2.%3.%4.%5.%6.%7.%8.%9"/>
+      <w:lvlJc w:val="left"/>
+      <w:pPr>
+        <w:ind w:left="2860" w:hanging="1800"/>
+      </w:pPr>
+      <w:rPr>
+        <w:rFonts w:hint="default"/>
+      </w:rPr>
     </w:lvl>
   </w:abstractNum>
   <w:abstractNum w:abstractNumId="23" w15:restartNumberingAfterBreak="0">

</xml_diff>